<commit_message>
docs(sad): add architecture goals, constraints and stakeholders
</commit_message>
<xml_diff>
--- a/docs/sad/SAD_BankManagementSystem_v1.0.docx
+++ b/docs/sad/SAD_BankManagementSystem_v1.0.docx
@@ -243,7 +243,14 @@
       </w:r>
       <w:r>
         <w:br/>
-        <w:t>Goals: secure, reliable, 99.9% availability. Constraints: PCI-DSS compliance, ATM hardware limits.</w:t>
+      </w:r>
+      <w:r>
+        <w:t xml:space="preserve">Goals: secure handling of customer data and money movements; consistent balances (all-or-nothing transactions); responsiveness (target: 95 % of transactions within 3 s with 50 concurrent users, BMS-NF-001); availability target 99.5 % (BMS-NF-002); modularity so that four developers can work in parallel; testability per layer. </w:t>
+      </w:r>
+    </w:p>
+    <w:p>
+      <w:r>
+        <w:t>Constraints: single-bank scope with no external payment networks; TLS 1.2+ for client–server traffic (BMS-SR-001); fixed stack (Python 3, FastAPI, SQLite via SQLAlchemy, HTML/CSS/JavaScript, pytest, GitHub Actions); delivery in two one-week sprints (19–23 Oct and 26–30 Oct 2026).</w:t>
       </w:r>
     </w:p>
     <w:p>
@@ -260,19 +267,58 @@
       </w:r>
       <w:r>
         <w:br/>
-        <w:t>Customers: security, availability</w:t>
-      </w:r>
-      <w:r>
-        <w:br/>
-        <w:t>Bank Ops: maintainability</w:t>
-      </w:r>
-      <w:r>
-        <w:br/>
-        <w:t>Regulators: compliance</w:t>
-      </w:r>
-      <w:r>
-        <w:br/>
-        <w:t>Developers: modularity.</w:t>
+        <w:t xml:space="preserve">Customer: </w:t>
+      </w:r>
+      <w:r>
+        <w:t>Security of funds and data, correct balances, ease of use</w:t>
+      </w:r>
+      <w:r>
+        <w:br/>
+      </w:r>
+      <w:r>
+        <w:t>Teller</w:t>
+      </w:r>
+      <w:r>
+        <w:t xml:space="preserve">: </w:t>
+      </w:r>
+      <w:r>
+        <w:t>Fast account opening, deposits, withdrawals and search</w:t>
+      </w:r>
+    </w:p>
+    <w:p>
+      <w:r>
+        <w:t>Admin/Branch Manager: Control of staff access, audit trails, reports</w:t>
+      </w:r>
+      <w:r>
+        <w:br/>
+      </w:r>
+      <w:r>
+        <w:t>Bank/</w:t>
+      </w:r>
+      <w:r>
+        <w:t xml:space="preserve">Regulator: </w:t>
+      </w:r>
+      <w:r>
+        <w:t>Traceability, audit retention, data protection</w:t>
+      </w:r>
+      <w:r>
+        <w:br/>
+        <w:t>Developers</w:t>
+      </w:r>
+      <w:r>
+        <w:t xml:space="preserve"> &amp; testers</w:t>
+      </w:r>
+      <w:r>
+        <w:t xml:space="preserve">: </w:t>
+      </w:r>
+      <w:r>
+        <w:t>M</w:t>
+      </w:r>
+      <w:r>
+        <w:t>odularity</w:t>
+      </w:r>
+      <w:r>
+        <w:t>, clear interfaces, testability</w:t>
       </w:r>
     </w:p>
     <w:p>
@@ -345,6 +391,7 @@
         <w:pStyle w:val="Heading2"/>
       </w:pPr>
       <w:r>
+        <w:lastRenderedPageBreak/>
         <w:t>3.5 Chosen Architecture Pattern and Rationale</w:t>
       </w:r>
     </w:p>
@@ -384,7 +431,6 @@
         <w:pStyle w:val="Heading2"/>
       </w:pPr>
       <w:r>
-        <w:lastRenderedPageBreak/>
         <w:t>3.8 Traceability to Requirements</w:t>
       </w:r>
     </w:p>
@@ -490,15 +536,7 @@
       </w:r>
       <w:r>
         <w:br/>
-        <w:t>Request: {</w:t>
-      </w:r>
-      <w:proofErr w:type="spellStart"/>
-      <w:r>
-        <w:t>cardId</w:t>
-      </w:r>
-      <w:proofErr w:type="spellEnd"/>
-      <w:r>
-        <w:t>, pin, amount}</w:t>
+        <w:t>Request: {cardId, pin, amount}</w:t>
       </w:r>
       <w:r>
         <w:br/>
@@ -527,6 +565,7 @@
         <w:pStyle w:val="Heading2"/>
       </w:pPr>
       <w:r>
+        <w:lastRenderedPageBreak/>
         <w:t>4.5 UX Design</w:t>
       </w:r>
     </w:p>
@@ -566,15 +605,7 @@
       </w:r>
       <w:r>
         <w:br/>
-        <w:t xml:space="preserve">5.3 Tools: </w:t>
-      </w:r>
-      <w:proofErr w:type="spellStart"/>
-      <w:r>
-        <w:t>PlantUML</w:t>
-      </w:r>
-      <w:proofErr w:type="spellEnd"/>
-      <w:r>
-        <w:t>, draw.io, Swagger.</w:t>
+        <w:t>5.3 Tools: PlantUML, draw.io, Swagger.</w:t>
       </w:r>
     </w:p>
     <w:sectPr>
@@ -1195,6 +1226,15 @@
       <w:szCs w:val="24"/>
     </w:rPr>
   </w:style>
+  <w:style w:type="paragraph" w:styleId="NoSpacing">
+    <w:name w:val="No Spacing"/>
+    <w:uiPriority w:val="1"/>
+    <w:qFormat/>
+    <w:rsid w:val="00CA7C5E"/>
+    <w:pPr>
+      <w:spacing w:after="0" w:line="240" w:lineRule="auto"/>
+    </w:pPr>
+  </w:style>
 </w:styles>
 </file>
 

</xml_diff>

<commit_message>
docs(sad): add component diagram and component descriptions
</commit_message>
<xml_diff>
--- a/docs/sad/SAD_BankManagementSystem_v1.0.docx
+++ b/docs/sad/SAD_BankManagementSystem_v1.0.docx
@@ -335,6 +335,303 @@
       </w:pPr>
     </w:p>
     <w:p>
+      <w:r>
+        <w:rPr>
+          <w:noProof/>
+        </w:rPr>
+        <w:lastRenderedPageBreak/>
+        <w:drawing>
+          <wp:inline distT="0" distB="0" distL="0" distR="0" wp14:anchorId="7CBEEEBD" wp14:editId="24E51B12">
+            <wp:extent cx="5486400" cy="2967990"/>
+            <wp:effectExtent l="0" t="0" r="0" b="3810"/>
+            <wp:docPr id="175493049" name="Picture 2"/>
+            <wp:cNvGraphicFramePr>
+              <a:graphicFrameLocks xmlns:a="http://schemas.openxmlformats.org/drawingml/2006/main" noChangeAspect="1"/>
+            </wp:cNvGraphicFramePr>
+            <a:graphic xmlns:a="http://schemas.openxmlformats.org/drawingml/2006/main">
+              <a:graphicData uri="http://schemas.openxmlformats.org/drawingml/2006/picture">
+                <pic:pic xmlns:pic="http://schemas.openxmlformats.org/drawingml/2006/picture">
+                  <pic:nvPicPr>
+                    <pic:cNvPr id="175493049" name="Picture 2"/>
+                    <pic:cNvPicPr/>
+                  </pic:nvPicPr>
+                  <pic:blipFill>
+                    <a:blip r:embed="rId5" cstate="print">
+                      <a:extLst>
+                        <a:ext uri="{28A0092B-C50C-407E-A947-70E740481C1C}">
+                          <a14:useLocalDpi xmlns:a14="http://schemas.microsoft.com/office/drawing/2010/main" val="0"/>
+                        </a:ext>
+                      </a:extLst>
+                    </a:blip>
+                    <a:stretch>
+                      <a:fillRect/>
+                    </a:stretch>
+                  </pic:blipFill>
+                  <pic:spPr>
+                    <a:xfrm>
+                      <a:off x="0" y="0"/>
+                      <a:ext cx="5486400" cy="2967990"/>
+                    </a:xfrm>
+                    <a:prstGeom prst="rect">
+                      <a:avLst/>
+                    </a:prstGeom>
+                  </pic:spPr>
+                </pic:pic>
+              </a:graphicData>
+            </a:graphic>
+          </wp:inline>
+        </w:drawing>
+      </w:r>
+    </w:p>
+    <w:p>
+      <w:pPr>
+        <w:jc w:val="center"/>
+        <w:rPr>
+          <w:i/>
+          <w:iCs/>
+        </w:rPr>
+      </w:pPr>
+      <w:r>
+        <w:rPr>
+          <w:i/>
+          <w:iCs/>
+        </w:rPr>
+        <w:t>Figure 1 — Component diagram</w:t>
+      </w:r>
+    </w:p>
+    <w:p>
+      <w:r>
+        <w:t xml:space="preserve">The system is organised in layers. The Web UI calls REST controllers over HTTPS; controllers pass through the Security Layer and delegate to five services; services use a single Data Access Layer; every service </w:t>
+      </w:r>
+      <w:proofErr w:type="gramStart"/>
+      <w:r>
+        <w:t>reports</w:t>
+      </w:r>
+      <w:proofErr w:type="gramEnd"/>
+      <w:r>
+        <w:t xml:space="preserve"> security-relevant events to the Audit &amp; Notification Service</w:t>
+      </w:r>
+      <w:r>
+        <w:t>.</w:t>
+      </w:r>
+    </w:p>
+    <w:p>
+      <w:pPr>
+        <w:pStyle w:val="Heading2"/>
+      </w:pPr>
+      <w:r>
+        <w:t>3.4 Component Descriptions</w:t>
+      </w:r>
+    </w:p>
+    <w:p>
+      <w:pPr>
+        <w:rPr>
+          <w:lang w:val="en-IN"/>
+        </w:rPr>
+      </w:pPr>
+      <w:r>
+        <w:rPr>
+          <w:lang w:val="en-IN"/>
+        </w:rPr>
+        <w:t>- Web UI (DS-UI): handles user input/output for Customer, Teller and Admin screens; performs client-side validation.</w:t>
+      </w:r>
+    </w:p>
+    <w:p>
+      <w:pPr>
+        <w:rPr>
+          <w:lang w:val="en-IN"/>
+        </w:rPr>
+      </w:pPr>
+      <w:r>
+        <w:rPr>
+          <w:lang w:val="en-IN"/>
+        </w:rPr>
+        <w:t>- Auth Service (DS-AUTH): validates login, locks accounts after 3 failed attempts, manages sessions and roles, handles password change.</w:t>
+      </w:r>
+    </w:p>
+    <w:p>
+      <w:pPr>
+        <w:rPr>
+          <w:lang w:val="en-IN"/>
+        </w:rPr>
+      </w:pPr>
+      <w:r>
+        <w:rPr>
+          <w:lang w:val="en-IN"/>
+        </w:rPr>
+        <w:t>- Account Service (DS-ACC): opens and maintains accounts, creates the customer login, freezes/closes accounts, balance view and search.</w:t>
+      </w:r>
+    </w:p>
+    <w:p>
+      <w:pPr>
+        <w:rPr>
+          <w:lang w:val="en-IN"/>
+        </w:rPr>
+      </w:pPr>
+      <w:r>
+        <w:rPr>
+          <w:lang w:val="en-IN"/>
+        </w:rPr>
+        <w:t>- Transaction Service (DS-TXN): processes deposits, withdrawals, transfers, history and statements as all-or-nothing transactions.</w:t>
+      </w:r>
+    </w:p>
+    <w:p>
+      <w:pPr>
+        <w:rPr>
+          <w:lang w:val="en-IN"/>
+        </w:rPr>
+      </w:pPr>
+      <w:r>
+        <w:rPr>
+          <w:lang w:val="en-IN"/>
+        </w:rPr>
+        <w:t>- Admin and Reporting Service (DS-ADM): manages Teller users and produces the daily transaction report.</w:t>
+      </w:r>
+    </w:p>
+    <w:p>
+      <w:pPr>
+        <w:rPr>
+          <w:lang w:val="en-IN"/>
+        </w:rPr>
+      </w:pPr>
+      <w:r>
+        <w:rPr>
+          <w:lang w:val="en-IN"/>
+        </w:rPr>
+        <w:t>- Audit and Notification Service (DS-AUD): records the append-only audit log and sends simulated transaction notifications.</w:t>
+      </w:r>
+    </w:p>
+    <w:p>
+      <w:pPr>
+        <w:rPr>
+          <w:lang w:val="en-IN"/>
+        </w:rPr>
+      </w:pPr>
+      <w:r>
+        <w:rPr>
+          <w:lang w:val="en-IN"/>
+        </w:rPr>
+        <w:t>- Security Layer (DS-SEC): enforces TLS, input validation, masking of account numbers and rate limiting.</w:t>
+      </w:r>
+    </w:p>
+    <w:p>
+      <w:pPr>
+        <w:rPr>
+          <w:lang w:val="en-IN"/>
+        </w:rPr>
+      </w:pPr>
+      <w:r>
+        <w:rPr>
+          <w:lang w:val="en-IN"/>
+        </w:rPr>
+        <w:lastRenderedPageBreak/>
+        <w:t>- Data Access Layer and Database (DS-DB): account, customer, user, transaction, audit and notification data storage.</w:t>
+      </w:r>
+    </w:p>
+    <w:p>
+      <w:pPr>
+        <w:pStyle w:val="Heading2"/>
+      </w:pPr>
+      <w:r>
+        <w:t>3.5 Chosen Architecture Pattern and Rationale</w:t>
+      </w:r>
+    </w:p>
+    <w:p>
+      <w:r>
+        <w:t>Layered architecture chosen for clear separation of concerns. Microservices rejected as overly complex for ATM scale.</w:t>
+      </w:r>
+    </w:p>
+    <w:p>
+      <w:pPr>
+        <w:pStyle w:val="Heading2"/>
+      </w:pPr>
+      <w:r>
+        <w:t>3.6 Technology Stack &amp; Data Stores</w:t>
+      </w:r>
+    </w:p>
+    <w:p>
+      <w:r>
+        <w:t>Java, Spring Boot APIs, MySQL DB, TLS encryption. ATM terminals use secure modules.</w:t>
+      </w:r>
+    </w:p>
+    <w:p>
+      <w:pPr>
+        <w:pStyle w:val="Heading2"/>
+      </w:pPr>
+      <w:r>
+        <w:t>3.7 Risks &amp; Mitigations</w:t>
+      </w:r>
+    </w:p>
+    <w:p>
+      <w:r>
+        <w:t>Risk: ATM downtime due to network failure → Mitigation: redundant connections.</w:t>
+      </w:r>
+    </w:p>
+    <w:p>
+      <w:pPr>
+        <w:pStyle w:val="Heading2"/>
+      </w:pPr>
+      <w:r>
+        <w:t>3.8 Traceability to Requirements</w:t>
+      </w:r>
+    </w:p>
+    <w:p>
+      <w:r>
+        <w:t>R1 (PIN validation) → Auth Service</w:t>
+      </w:r>
+      <w:r>
+        <w:br/>
+        <w:t>R2 (Cash withdrawal) → Transaction Processor</w:t>
+      </w:r>
+    </w:p>
+    <w:p>
+      <w:pPr>
+        <w:pStyle w:val="Heading2"/>
+      </w:pPr>
+      <w:r>
+        <w:t>3.9 Security Architecture</w:t>
+      </w:r>
+    </w:p>
+    <w:p>
+      <w:r>
+        <w:t>Threat Modeling (STRIDE): Spoofing → chip validation; Tampering → secure boot; Info disclosure → TLS; DoS → rate limiting; Elevation of Privilege → RBAC.</w:t>
+      </w:r>
+    </w:p>
+    <w:p>
+      <w:pPr>
+        <w:pStyle w:val="Heading1"/>
+      </w:pPr>
+      <w:r>
+        <w:t>4. Design</w:t>
+      </w:r>
+    </w:p>
+    <w:p>
+      <w:pPr>
+        <w:pStyle w:val="Heading2"/>
+      </w:pPr>
+      <w:r>
+        <w:t>4.1 Design Overview</w:t>
+      </w:r>
+    </w:p>
+    <w:p>
+      <w:r>
+        <w:t>ATM designed with layered modules for separation of concerns and easier maintenance.</w:t>
+      </w:r>
+    </w:p>
+    <w:p>
+      <w:pPr>
+        <w:pStyle w:val="Heading2"/>
+      </w:pPr>
+      <w:r>
+        <w:t>4.2 UML Sequence Diagrams</w:t>
+      </w:r>
+    </w:p>
+    <w:p>
+      <w:r>
+        <w:t>At least 2 sequence diagrams covering 2 flows specific to your project</w:t>
+      </w:r>
+    </w:p>
+    <w:p>
       <w:pPr>
         <w:ind w:left="720" w:firstLine="720"/>
       </w:pPr>
@@ -346,162 +643,6 @@
           <w:b/>
           <w:bCs/>
         </w:rPr>
-        <w:t xml:space="preserve"> Insert UML Component Diagram here</w:t>
-      </w:r>
-      <w:r>
-        <w:t>&gt;&gt;</w:t>
-      </w:r>
-    </w:p>
-    <w:p>
-      <w:pPr>
-        <w:ind w:left="720" w:firstLine="720"/>
-      </w:pPr>
-    </w:p>
-    <w:p>
-      <w:pPr>
-        <w:pStyle w:val="Heading2"/>
-      </w:pPr>
-      <w:r>
-        <w:t>3.4 Component Descriptions</w:t>
-      </w:r>
-    </w:p>
-    <w:p>
-      <w:r>
-        <w:t>- ATM UI: handles customer input/output.</w:t>
-      </w:r>
-      <w:r>
-        <w:br/>
-        <w:t>- Auth Service: validates PIN.</w:t>
-      </w:r>
-      <w:r>
-        <w:br/>
-        <w:t>- Transaction Processor: processes withdrawals, deposits, transfers.</w:t>
-      </w:r>
-      <w:r>
-        <w:br/>
-        <w:t>- Bank Server API: backend integration.</w:t>
-      </w:r>
-      <w:r>
-        <w:br/>
-        <w:t>- Database: account and transaction data storage.</w:t>
-      </w:r>
-    </w:p>
-    <w:p>
-      <w:pPr>
-        <w:pStyle w:val="Heading2"/>
-      </w:pPr>
-      <w:r>
-        <w:lastRenderedPageBreak/>
-        <w:t>3.5 Chosen Architecture Pattern and Rationale</w:t>
-      </w:r>
-    </w:p>
-    <w:p>
-      <w:r>
-        <w:t>Layered architecture chosen for clear separation of concerns. Microservices rejected as overly complex for ATM scale.</w:t>
-      </w:r>
-    </w:p>
-    <w:p>
-      <w:pPr>
-        <w:pStyle w:val="Heading2"/>
-      </w:pPr>
-      <w:r>
-        <w:t>3.6 Technology Stack &amp; Data Stores</w:t>
-      </w:r>
-    </w:p>
-    <w:p>
-      <w:r>
-        <w:t>Java, Spring Boot APIs, MySQL DB, TLS encryption. ATM terminals use secure modules.</w:t>
-      </w:r>
-    </w:p>
-    <w:p>
-      <w:pPr>
-        <w:pStyle w:val="Heading2"/>
-      </w:pPr>
-      <w:r>
-        <w:t>3.7 Risks &amp; Mitigations</w:t>
-      </w:r>
-    </w:p>
-    <w:p>
-      <w:r>
-        <w:t>Risk: ATM downtime due to network failure → Mitigation: redundant connections.</w:t>
-      </w:r>
-    </w:p>
-    <w:p>
-      <w:pPr>
-        <w:pStyle w:val="Heading2"/>
-      </w:pPr>
-      <w:r>
-        <w:t>3.8 Traceability to Requirements</w:t>
-      </w:r>
-    </w:p>
-    <w:p>
-      <w:r>
-        <w:t>R1 (PIN validation) → Auth Service</w:t>
-      </w:r>
-      <w:r>
-        <w:br/>
-        <w:t>R2 (Cash withdrawal) → Transaction Processor</w:t>
-      </w:r>
-    </w:p>
-    <w:p>
-      <w:pPr>
-        <w:pStyle w:val="Heading2"/>
-      </w:pPr>
-      <w:r>
-        <w:t>3.9 Security Architecture</w:t>
-      </w:r>
-    </w:p>
-    <w:p>
-      <w:r>
-        <w:t>Threat Modeling (STRIDE): Spoofing → chip validation; Tampering → secure boot; Info disclosure → TLS; DoS → rate limiting; Elevation of Privilege → RBAC.</w:t>
-      </w:r>
-    </w:p>
-    <w:p>
-      <w:pPr>
-        <w:pStyle w:val="Heading1"/>
-      </w:pPr>
-      <w:r>
-        <w:t>4. Design</w:t>
-      </w:r>
-    </w:p>
-    <w:p>
-      <w:pPr>
-        <w:pStyle w:val="Heading2"/>
-      </w:pPr>
-      <w:r>
-        <w:t>4.1 Design Overview</w:t>
-      </w:r>
-    </w:p>
-    <w:p>
-      <w:r>
-        <w:t>ATM designed with layered modules for separation of concerns and easier maintenance.</w:t>
-      </w:r>
-    </w:p>
-    <w:p>
-      <w:pPr>
-        <w:pStyle w:val="Heading2"/>
-      </w:pPr>
-      <w:r>
-        <w:t>4.2 UML Sequence Diagrams</w:t>
-      </w:r>
-    </w:p>
-    <w:p>
-      <w:r>
-        <w:t>At least 2 sequence diagrams covering 2 flows specific to your project</w:t>
-      </w:r>
-    </w:p>
-    <w:p>
-      <w:pPr>
-        <w:ind w:left="720" w:firstLine="720"/>
-      </w:pPr>
-      <w:r>
-        <w:t>&lt;&lt;</w:t>
-      </w:r>
-      <w:r>
-        <w:rPr>
-          <w:b/>
-          <w:bCs/>
-        </w:rPr>
         <w:t xml:space="preserve"> Insert Sequence Diagram here</w:t>
       </w:r>
       <w:r>
@@ -552,6 +693,7 @@
         <w:pStyle w:val="Heading2"/>
       </w:pPr>
       <w:r>
+        <w:lastRenderedPageBreak/>
         <w:t>4.4 Error Handling, Logging &amp; Monitoring</w:t>
       </w:r>
     </w:p>
@@ -565,7 +707,6 @@
         <w:pStyle w:val="Heading2"/>
       </w:pPr>
       <w:r>
-        <w:lastRenderedPageBreak/>
         <w:t>4.5 UX Design</w:t>
       </w:r>
     </w:p>

</xml_diff>

<commit_message>
docs(sad): add architecture pattern rationale, technology stack and risks
</commit_message>
<xml_diff>
--- a/docs/sad/SAD_BankManagementSystem_v1.0.docx
+++ b/docs/sad/SAD_BankManagementSystem_v1.0.docx
@@ -250,7 +250,31 @@
     </w:p>
     <w:p>
       <w:r>
-        <w:t>Constraints: single-bank scope with no external payment networks; TLS 1.2+ for client–server traffic (BMS-SR-001); fixed stack (Python 3, FastAPI, SQLite via SQLAlchemy, HTML/CSS/JavaScript, pytest, GitHub Actions); delivery in two one-week sprints (19–23 Oct and 26–30 Oct 2026).</w:t>
+        <w:t xml:space="preserve">Constraints: single-bank scope with no external payment networks; TLS 1.2+ for client–server traffic (BMS-SR-001); fixed stack (Python 3, </w:t>
+      </w:r>
+      <w:proofErr w:type="spellStart"/>
+      <w:r>
+        <w:t>FastAPI</w:t>
+      </w:r>
+      <w:proofErr w:type="spellEnd"/>
+      <w:r>
+        <w:t xml:space="preserve">, SQLite via </w:t>
+      </w:r>
+      <w:proofErr w:type="spellStart"/>
+      <w:r>
+        <w:t>SQLAlchemy</w:t>
+      </w:r>
+      <w:proofErr w:type="spellEnd"/>
+      <w:r>
+        <w:t xml:space="preserve">, HTML/CSS/JavaScript, </w:t>
+      </w:r>
+      <w:proofErr w:type="spellStart"/>
+      <w:r>
+        <w:t>pytest</w:t>
+      </w:r>
+      <w:proofErr w:type="spellEnd"/>
+      <w:r>
+        <w:t>, GitHub Actions); delivery in two one-week sprints (19–23 Oct and 26–30 Oct 2026).</w:t>
       </w:r>
     </w:p>
     <w:p>
@@ -401,7 +425,15 @@
     </w:p>
     <w:p>
       <w:r>
-        <w:t xml:space="preserve">The system is organised in layers. The Web UI calls REST controllers over HTTPS; controllers pass through the Security Layer and delegate to five services; services use a single Data Access Layer; every service </w:t>
+        <w:t xml:space="preserve">The system is </w:t>
+      </w:r>
+      <w:proofErr w:type="spellStart"/>
+      <w:r>
+        <w:t>organised</w:t>
+      </w:r>
+      <w:proofErr w:type="spellEnd"/>
+      <w:r>
+        <w:t xml:space="preserve"> in layers. The Web UI calls REST controllers over HTTPS; controllers pass through the Security Layer and delegate to five services; services use a single Data Access Layer; every service </w:t>
       </w:r>
       <w:proofErr w:type="gramStart"/>
       <w:r>
@@ -537,34 +569,228 @@
       </w:r>
     </w:p>
     <w:p>
-      <w:r>
-        <w:t>Layered architecture chosen for clear separation of concerns. Microservices rejected as overly complex for ATM scale.</w:t>
-      </w:r>
-    </w:p>
-    <w:p>
       <w:pPr>
         <w:pStyle w:val="Heading2"/>
+        <w:rPr>
+          <w:rFonts w:ascii="Cambria" w:eastAsia="Cambria" w:hAnsi="Cambria" w:cs="Cambria"/>
+          <w:b w:val="0"/>
+          <w:bCs w:val="0"/>
+          <w:color w:val="auto"/>
+          <w:sz w:val="22"/>
+          <w:szCs w:val="22"/>
+        </w:rPr>
+      </w:pPr>
+      <w:r>
+        <w:rPr>
+          <w:rFonts w:ascii="Cambria" w:eastAsia="Cambria" w:hAnsi="Cambria" w:cs="Cambria"/>
+          <w:b w:val="0"/>
+          <w:bCs w:val="0"/>
+          <w:color w:val="auto"/>
+          <w:sz w:val="22"/>
+          <w:szCs w:val="22"/>
+        </w:rPr>
+        <w:t>Layered architecture (Presentation, API, Service, Data Access, Database) chosen for clear separation of concerns, easier testing of each layer and parallel development by the team. Microservices rejected as overly complex for a single-bank system built by four developers in two one-week sprints.</w:t>
+      </w:r>
+    </w:p>
+    <w:p>
+      <w:pPr>
+        <w:pStyle w:val="Heading2"/>
       </w:pPr>
       <w:r>
         <w:t>3.6 Technology Stack &amp; Data Stores</w:t>
       </w:r>
     </w:p>
     <w:p>
-      <w:r>
-        <w:t>Java, Spring Boot APIs, MySQL DB, TLS encryption. ATM terminals use secure modules.</w:t>
-      </w:r>
-    </w:p>
-    <w:p>
       <w:pPr>
         <w:pStyle w:val="Heading2"/>
+        <w:rPr>
+          <w:rFonts w:ascii="Cambria" w:eastAsia="Cambria" w:hAnsi="Cambria" w:cs="Cambria"/>
+          <w:b w:val="0"/>
+          <w:bCs w:val="0"/>
+          <w:color w:val="auto"/>
+          <w:sz w:val="22"/>
+          <w:szCs w:val="22"/>
+        </w:rPr>
+      </w:pPr>
+      <w:r>
+        <w:rPr>
+          <w:rFonts w:ascii="Cambria" w:eastAsia="Cambria" w:hAnsi="Cambria" w:cs="Cambria"/>
+          <w:b w:val="0"/>
+          <w:bCs w:val="0"/>
+          <w:color w:val="auto"/>
+          <w:sz w:val="22"/>
+          <w:szCs w:val="22"/>
+        </w:rPr>
+        <w:t xml:space="preserve">Python 3, </w:t>
+      </w:r>
+      <w:proofErr w:type="spellStart"/>
+      <w:r>
+        <w:rPr>
+          <w:rFonts w:ascii="Cambria" w:eastAsia="Cambria" w:hAnsi="Cambria" w:cs="Cambria"/>
+          <w:b w:val="0"/>
+          <w:bCs w:val="0"/>
+          <w:color w:val="auto"/>
+          <w:sz w:val="22"/>
+          <w:szCs w:val="22"/>
+        </w:rPr>
+        <w:t>FastAPI</w:t>
+      </w:r>
+      <w:proofErr w:type="spellEnd"/>
+      <w:r>
+        <w:rPr>
+          <w:rFonts w:ascii="Cambria" w:eastAsia="Cambria" w:hAnsi="Cambria" w:cs="Cambria"/>
+          <w:b w:val="0"/>
+          <w:bCs w:val="0"/>
+          <w:color w:val="auto"/>
+          <w:sz w:val="22"/>
+          <w:szCs w:val="22"/>
+        </w:rPr>
+        <w:t xml:space="preserve"> REST APIs, SQLite DB (via </w:t>
+      </w:r>
+      <w:proofErr w:type="spellStart"/>
+      <w:r>
+        <w:rPr>
+          <w:rFonts w:ascii="Cambria" w:eastAsia="Cambria" w:hAnsi="Cambria" w:cs="Cambria"/>
+          <w:b w:val="0"/>
+          <w:bCs w:val="0"/>
+          <w:color w:val="auto"/>
+          <w:sz w:val="22"/>
+          <w:szCs w:val="22"/>
+        </w:rPr>
+        <w:t>SQLAlchemy</w:t>
+      </w:r>
+      <w:proofErr w:type="spellEnd"/>
+      <w:r>
+        <w:rPr>
+          <w:rFonts w:ascii="Cambria" w:eastAsia="Cambria" w:hAnsi="Cambria" w:cs="Cambria"/>
+          <w:b w:val="0"/>
+          <w:bCs w:val="0"/>
+          <w:color w:val="auto"/>
+          <w:sz w:val="22"/>
+          <w:szCs w:val="22"/>
+        </w:rPr>
+        <w:t xml:space="preserve">), HTML/CSS/JavaScript web UI, TLS encryption, </w:t>
+      </w:r>
+      <w:proofErr w:type="spellStart"/>
+      <w:r>
+        <w:rPr>
+          <w:rFonts w:ascii="Cambria" w:eastAsia="Cambria" w:hAnsi="Cambria" w:cs="Cambria"/>
+          <w:b w:val="0"/>
+          <w:bCs w:val="0"/>
+          <w:color w:val="auto"/>
+          <w:sz w:val="22"/>
+          <w:szCs w:val="22"/>
+        </w:rPr>
+        <w:t>bcrypt</w:t>
+      </w:r>
+      <w:proofErr w:type="spellEnd"/>
+      <w:r>
+        <w:rPr>
+          <w:rFonts w:ascii="Cambria" w:eastAsia="Cambria" w:hAnsi="Cambria" w:cs="Cambria"/>
+          <w:b w:val="0"/>
+          <w:bCs w:val="0"/>
+          <w:color w:val="auto"/>
+          <w:sz w:val="22"/>
+          <w:szCs w:val="22"/>
+        </w:rPr>
+        <w:t xml:space="preserve"> password hashing, </w:t>
+      </w:r>
+      <w:proofErr w:type="spellStart"/>
+      <w:r>
+        <w:rPr>
+          <w:rFonts w:ascii="Cambria" w:eastAsia="Cambria" w:hAnsi="Cambria" w:cs="Cambria"/>
+          <w:b w:val="0"/>
+          <w:bCs w:val="0"/>
+          <w:color w:val="auto"/>
+          <w:sz w:val="22"/>
+          <w:szCs w:val="22"/>
+        </w:rPr>
+        <w:t>pytest</w:t>
+      </w:r>
+      <w:proofErr w:type="spellEnd"/>
+      <w:r>
+        <w:rPr>
+          <w:rFonts w:ascii="Cambria" w:eastAsia="Cambria" w:hAnsi="Cambria" w:cs="Cambria"/>
+          <w:b w:val="0"/>
+          <w:bCs w:val="0"/>
+          <w:color w:val="auto"/>
+          <w:sz w:val="22"/>
+          <w:szCs w:val="22"/>
+        </w:rPr>
+        <w:t>, GitHub Actions.</w:t>
+      </w:r>
+    </w:p>
+    <w:p>
+      <w:pPr>
+        <w:pStyle w:val="Heading2"/>
       </w:pPr>
       <w:r>
         <w:t>3.7 Risks &amp; Mitigations</w:t>
       </w:r>
     </w:p>
     <w:p>
-      <w:r>
-        <w:t>Risk: ATM downtime due to network failure → Mitigation: redundant connections.</w:t>
+      <w:pPr>
+        <w:rPr>
+          <w:lang w:val="en-IN"/>
+        </w:rPr>
+      </w:pPr>
+      <w:r>
+        <w:rPr>
+          <w:lang w:val="en-IN"/>
+        </w:rPr>
+        <w:t>Risk: Partial update of balances during a failed transfer → Mitigation: every money movement runs in a single database transaction with rollback.</w:t>
+      </w:r>
+    </w:p>
+    <w:p>
+      <w:pPr>
+        <w:rPr>
+          <w:lang w:val="en-IN"/>
+        </w:rPr>
+      </w:pPr>
+      <w:r>
+        <w:rPr>
+          <w:lang w:val="en-IN"/>
+        </w:rPr>
+        <w:t>Risk: Unauthorised access to other customers' data → Mitigation: server-side role and ownership checks on every request.</w:t>
+      </w:r>
+    </w:p>
+    <w:p>
+      <w:pPr>
+        <w:rPr>
+          <w:lang w:val="en-IN"/>
+        </w:rPr>
+      </w:pPr>
+      <w:r>
+        <w:rPr>
+          <w:lang w:val="en-IN"/>
+        </w:rPr>
+        <w:t>Risk: Password guessing → Mitigation: lockout after 3 failed attempts and hashed passwords.</w:t>
+      </w:r>
+    </w:p>
+    <w:p>
+      <w:pPr>
+        <w:rPr>
+          <w:lang w:val="en-IN"/>
+        </w:rPr>
+      </w:pPr>
+      <w:r>
+        <w:rPr>
+          <w:lang w:val="en-IN"/>
+        </w:rPr>
+        <w:t>Risk: Slow response under 50 concurrent users → Mitigation: short transactions, indexing and a planned load test.</w:t>
+      </w:r>
+    </w:p>
+    <w:p>
+      <w:pPr>
+        <w:rPr>
+          <w:lang w:val="en-IN"/>
+        </w:rPr>
+      </w:pPr>
+      <w:r>
+        <w:rPr>
+          <w:lang w:val="en-IN"/>
+        </w:rPr>
+        <w:t>Risk: Tight two-sprint timeline → Mitigation: modules assigned to separate members using a shared requirement baseline.</w:t>
       </w:r>
     </w:p>
     <w:p>
@@ -623,6 +849,7 @@
         <w:pStyle w:val="Heading2"/>
       </w:pPr>
       <w:r>
+        <w:lastRenderedPageBreak/>
         <w:t>4.2 UML Sequence Diagrams</w:t>
       </w:r>
     </w:p>
@@ -677,7 +904,15 @@
       </w:r>
       <w:r>
         <w:br/>
-        <w:t>Request: {cardId, pin, amount}</w:t>
+        <w:t>Request: {</w:t>
+      </w:r>
+      <w:proofErr w:type="spellStart"/>
+      <w:r>
+        <w:t>cardId</w:t>
+      </w:r>
+      <w:proofErr w:type="spellEnd"/>
+      <w:r>
+        <w:t>, pin, amount}</w:t>
       </w:r>
       <w:r>
         <w:br/>
@@ -693,7 +928,6 @@
         <w:pStyle w:val="Heading2"/>
       </w:pPr>
       <w:r>
-        <w:lastRenderedPageBreak/>
         <w:t>4.4 Error Handling, Logging &amp; Monitoring</w:t>
       </w:r>
     </w:p>
@@ -746,7 +980,15 @@
       </w:r>
       <w:r>
         <w:br/>
-        <w:t>5.3 Tools: PlantUML, draw.io, Swagger.</w:t>
+        <w:t xml:space="preserve">5.3 Tools: </w:t>
+      </w:r>
+      <w:proofErr w:type="spellStart"/>
+      <w:r>
+        <w:t>PlantUML</w:t>
+      </w:r>
+      <w:proofErr w:type="spellEnd"/>
+      <w:r>
+        <w:t>, draw.io, Swagger.</w:t>
       </w:r>
     </w:p>
     <w:sectPr>

</xml_diff>

<commit_message>
docs(sad): add requirements traceability table
</commit_message>
<xml_diff>
--- a/docs/sad/SAD_BankManagementSystem_v1.0.docx
+++ b/docs/sad/SAD_BankManagementSystem_v1.0.docx
@@ -433,15 +433,7 @@
       </w:r>
       <w:proofErr w:type="spellEnd"/>
       <w:r>
-        <w:t xml:space="preserve"> in layers. The Web UI calls REST controllers over HTTPS; controllers pass through the Security Layer and delegate to five services; services use a single Data Access Layer; every service </w:t>
-      </w:r>
-      <w:proofErr w:type="gramStart"/>
-      <w:r>
-        <w:t>reports</w:t>
-      </w:r>
-      <w:proofErr w:type="gramEnd"/>
-      <w:r>
-        <w:t xml:space="preserve"> security-relevant events to the Audit &amp; Notification Service</w:t>
+        <w:t xml:space="preserve"> in layers. The Web UI calls REST controllers over HTTPS; controllers pass through the Security Layer and delegate to five services; services use a single Data Access Layer; every service reports security-relevant events to the Audit &amp; Notification Service</w:t>
       </w:r>
       <w:r>
         <w:t>.</w:t>
@@ -802,19 +794,416 @@
       </w:r>
     </w:p>
     <w:p>
-      <w:r>
-        <w:t>R1 (PIN validation) → Auth Service</w:t>
-      </w:r>
-      <w:r>
-        <w:br/>
-        <w:t>R2 (Cash withdrawal) → Transaction Processor</w:t>
-      </w:r>
-    </w:p>
+      <w:pPr>
+        <w:rPr>
+          <w:lang w:val="en-IN"/>
+        </w:rPr>
+      </w:pPr>
+      <w:r>
+        <w:rPr>
+          <w:lang w:val="en-IN"/>
+        </w:rPr>
+        <w:t>BMS-F-001 (Login) → Auth Service (DS-AUTH)</w:t>
+      </w:r>
+    </w:p>
+    <w:p>
+      <w:pPr>
+        <w:rPr>
+          <w:lang w:val="en-IN"/>
+        </w:rPr>
+      </w:pPr>
+      <w:r>
+        <w:rPr>
+          <w:lang w:val="en-IN"/>
+        </w:rPr>
+        <w:t>BMS-F-002 (Account lockout) → Auth Service, Audit Service (DS-AUTH, DS-AUD)</w:t>
+      </w:r>
+    </w:p>
+    <w:p>
+      <w:pPr>
+        <w:rPr>
+          <w:lang w:val="en-IN"/>
+        </w:rPr>
+      </w:pPr>
+      <w:r>
+        <w:rPr>
+          <w:lang w:val="en-IN"/>
+        </w:rPr>
+        <w:t>BMS-F-003 (Role-based access) → Auth Service (DS-AUTH)</w:t>
+      </w:r>
+    </w:p>
+    <w:p>
+      <w:pPr>
+        <w:rPr>
+          <w:lang w:val="en-IN"/>
+        </w:rPr>
+      </w:pPr>
+      <w:r>
+        <w:rPr>
+          <w:lang w:val="en-IN"/>
+        </w:rPr>
+        <w:t>BMS-F-004 (Change password) → Auth Service (DS-AUTH)</w:t>
+      </w:r>
+    </w:p>
+    <w:p>
+      <w:pPr>
+        <w:rPr>
+          <w:lang w:val="en-IN"/>
+        </w:rPr>
+      </w:pPr>
+      <w:r>
+        <w:rPr>
+          <w:lang w:val="en-IN"/>
+        </w:rPr>
+        <w:t>BMS-F-010 (Open account) → Account Service, Auth Service (DS-ACC, DS-AUTH)</w:t>
+      </w:r>
+    </w:p>
+    <w:p>
+      <w:pPr>
+        <w:rPr>
+          <w:lang w:val="en-IN"/>
+        </w:rPr>
+      </w:pPr>
+      <w:r>
+        <w:rPr>
+          <w:lang w:val="en-IN"/>
+        </w:rPr>
+        <w:t>BMS-F-011 (Update customer details) → Account Service (DS-ACC)</w:t>
+      </w:r>
+    </w:p>
+    <w:p>
+      <w:pPr>
+        <w:rPr>
+          <w:lang w:val="en-IN"/>
+        </w:rPr>
+      </w:pPr>
+      <w:r>
+        <w:rPr>
+          <w:lang w:val="en-IN"/>
+        </w:rPr>
+        <w:t>BMS-F-012 (Freeze/close account) → Account Service (DS-ACC)</w:t>
+      </w:r>
+    </w:p>
+    <w:p>
+      <w:pPr>
+        <w:rPr>
+          <w:lang w:val="en-IN"/>
+        </w:rPr>
+      </w:pPr>
+      <w:r>
+        <w:rPr>
+          <w:lang w:val="en-IN"/>
+        </w:rPr>
+        <w:t>BMS-F-013 (View balance) → Account Service (DS-ACC)</w:t>
+      </w:r>
+    </w:p>
+    <w:p>
+      <w:pPr>
+        <w:rPr>
+          <w:lang w:val="en-IN"/>
+        </w:rPr>
+      </w:pPr>
+      <w:r>
+        <w:rPr>
+          <w:lang w:val="en-IN"/>
+        </w:rPr>
+        <w:lastRenderedPageBreak/>
+        <w:t>BMS-F-014 (Search customer) → Account Service (DS-ACC)</w:t>
+      </w:r>
+    </w:p>
+    <w:p>
+      <w:pPr>
+        <w:rPr>
+          <w:lang w:val="en-IN"/>
+        </w:rPr>
+      </w:pPr>
+      <w:r>
+        <w:rPr>
+          <w:lang w:val="en-IN"/>
+        </w:rPr>
+        <w:t>BMS-F-020 (Deposit) → Transaction Service (DS-TXN)</w:t>
+      </w:r>
+    </w:p>
+    <w:p>
+      <w:pPr>
+        <w:rPr>
+          <w:lang w:val="en-IN"/>
+        </w:rPr>
+      </w:pPr>
+      <w:r>
+        <w:rPr>
+          <w:lang w:val="en-IN"/>
+        </w:rPr>
+        <w:t>BMS-F-021 (Withdrawal) → Transaction Service (DS-TXN)</w:t>
+      </w:r>
+    </w:p>
+    <w:p>
+      <w:pPr>
+        <w:rPr>
+          <w:lang w:val="en-IN"/>
+        </w:rPr>
+      </w:pPr>
+      <w:r>
+        <w:rPr>
+          <w:lang w:val="en-IN"/>
+        </w:rPr>
+        <w:t>BMS-F-022 (Fund transfer) → Transaction Service (DS-TXN, DS-DB)</w:t>
+      </w:r>
+    </w:p>
+    <w:p>
+      <w:pPr>
+        <w:rPr>
+          <w:lang w:val="en-IN"/>
+        </w:rPr>
+      </w:pPr>
+      <w:r>
+        <w:rPr>
+          <w:lang w:val="en-IN"/>
+        </w:rPr>
+        <w:t>BMS-F-023 (Transaction history) → Transaction Service (DS-TXN)</w:t>
+      </w:r>
+    </w:p>
+    <w:p>
+      <w:pPr>
+        <w:rPr>
+          <w:lang w:val="en-IN"/>
+        </w:rPr>
+      </w:pPr>
+      <w:r>
+        <w:rPr>
+          <w:lang w:val="en-IN"/>
+        </w:rPr>
+        <w:t>BMS-F-024 (Statement download) → Transaction Service (DS-TXN)</w:t>
+      </w:r>
+    </w:p>
+    <w:p>
+      <w:pPr>
+        <w:rPr>
+          <w:lang w:val="en-IN"/>
+        </w:rPr>
+      </w:pPr>
+      <w:r>
+        <w:rPr>
+          <w:lang w:val="en-IN"/>
+        </w:rPr>
+        <w:t>BMS-F-030 (Manage staff users) → Admin and Reporting Service (DS-ADM)</w:t>
+      </w:r>
+    </w:p>
+    <w:p>
+      <w:pPr>
+        <w:rPr>
+          <w:lang w:val="en-IN"/>
+        </w:rPr>
+      </w:pPr>
+      <w:r>
+        <w:rPr>
+          <w:lang w:val="en-IN"/>
+        </w:rPr>
+        <w:t>BMS-F-031 (View audit log) → Audit and Notification Service (DS-AUD)</w:t>
+      </w:r>
+    </w:p>
+    <w:p>
+      <w:pPr>
+        <w:rPr>
+          <w:lang w:val="en-IN"/>
+        </w:rPr>
+      </w:pPr>
+      <w:r>
+        <w:rPr>
+          <w:lang w:val="en-IN"/>
+        </w:rPr>
+        <w:t>BMS-F-032 (Daily report) → Admin and Reporting Service (DS-ADM)</w:t>
+      </w:r>
+    </w:p>
+    <w:p>
+      <w:pPr>
+        <w:rPr>
+          <w:lang w:val="en-IN"/>
+        </w:rPr>
+      </w:pPr>
+      <w:r>
+        <w:rPr>
+          <w:lang w:val="en-IN"/>
+        </w:rPr>
+        <w:t>BMS-F-033 (Notifications) → Audit and Notification Service (DS-AUD)</w:t>
+      </w:r>
+    </w:p>
+    <w:p>
+      <w:pPr>
+        <w:rPr>
+          <w:lang w:val="en-IN"/>
+        </w:rPr>
+      </w:pPr>
+      <w:r>
+        <w:rPr>
+          <w:lang w:val="en-IN"/>
+        </w:rPr>
+        <w:t>BMS-NF-001 (Performance) → Transaction Service (DS-TXN)</w:t>
+      </w:r>
+    </w:p>
+    <w:p>
+      <w:pPr>
+        <w:rPr>
+          <w:lang w:val="en-IN"/>
+        </w:rPr>
+      </w:pPr>
+      <w:r>
+        <w:rPr>
+          <w:lang w:val="en-IN"/>
+        </w:rPr>
+        <w:t>BMS-NF-002 (Availability) → Web UI / platform health endpoint (DS-UI)</w:t>
+      </w:r>
+    </w:p>
+    <w:p>
+      <w:pPr>
+        <w:rPr>
+          <w:lang w:val="en-IN"/>
+        </w:rPr>
+      </w:pPr>
+      <w:r>
+        <w:rPr>
+          <w:lang w:val="en-IN"/>
+        </w:rPr>
+        <w:t>BMS-NF-003 (Atomic transactions) → Transaction Service, Data Access Layer (DS-TXN, DS-DB)</w:t>
+      </w:r>
+    </w:p>
+    <w:p>
+      <w:pPr>
+        <w:rPr>
+          <w:lang w:val="en-IN"/>
+        </w:rPr>
+      </w:pPr>
+      <w:r>
+        <w:rPr>
+          <w:lang w:val="en-IN"/>
+        </w:rPr>
+        <w:t>BMS-NF-004 (Usability) → Web UI (DS-UI)</w:t>
+      </w:r>
+    </w:p>
+    <w:p>
+      <w:pPr>
+        <w:rPr>
+          <w:lang w:val="en-IN"/>
+        </w:rPr>
+      </w:pPr>
+      <w:r>
+        <w:rPr>
+          <w:lang w:val="en-IN"/>
+        </w:rPr>
+        <w:t>BMS-NF-005 (Audit retention) → Audit and Notification Service (DS-AUD)</w:t>
+      </w:r>
+    </w:p>
+    <w:p>
+      <w:pPr>
+        <w:rPr>
+          <w:lang w:val="en-IN"/>
+        </w:rPr>
+      </w:pPr>
+      <w:r>
+        <w:rPr>
+          <w:lang w:val="en-IN"/>
+        </w:rPr>
+        <w:t>BMS-NF-006 (Browser compatibility) → Web UI (DS-UI)</w:t>
+      </w:r>
+    </w:p>
+    <w:p>
+      <w:pPr>
+        <w:rPr>
+          <w:lang w:val="en-IN"/>
+        </w:rPr>
+      </w:pPr>
+      <w:r>
+        <w:rPr>
+          <w:lang w:val="en-IN"/>
+        </w:rPr>
+        <w:t>BMS-SR-001 (TLS 1.2+) → Security Layer (DS-SEC)</w:t>
+      </w:r>
+    </w:p>
+    <w:p>
+      <w:pPr>
+        <w:rPr>
+          <w:lang w:val="en-IN"/>
+        </w:rPr>
+      </w:pPr>
+      <w:r>
+        <w:rPr>
+          <w:lang w:val="en-IN"/>
+        </w:rPr>
+        <w:t>BMS-SR-002 (Password hashing) → Auth Service (DS-AUTH)</w:t>
+      </w:r>
+    </w:p>
+    <w:p>
+      <w:pPr>
+        <w:rPr>
+          <w:lang w:val="en-IN"/>
+        </w:rPr>
+      </w:pPr>
+      <w:r>
+        <w:rPr>
+          <w:lang w:val="en-IN"/>
+        </w:rPr>
+        <w:t>BMS-SR-003 (Session timeout) → Auth Service (DS-AUTH)</w:t>
+      </w:r>
+    </w:p>
+    <w:p>
+      <w:pPr>
+        <w:rPr>
+          <w:lang w:val="en-IN"/>
+        </w:rPr>
+      </w:pPr>
+      <w:r>
+        <w:rPr>
+          <w:lang w:val="en-IN"/>
+        </w:rPr>
+        <w:t>BMS-SR-004 (Server-side authorisation) → Auth Service (DS-AUTH)</w:t>
+      </w:r>
+    </w:p>
+    <w:p>
+      <w:pPr>
+        <w:rPr>
+          <w:lang w:val="en-IN"/>
+        </w:rPr>
+      </w:pPr>
+      <w:r>
+        <w:rPr>
+          <w:lang w:val="en-IN"/>
+        </w:rPr>
+        <w:t>BMS-SR-005 (Input validation) → Security Layer (DS-SEC)</w:t>
+      </w:r>
+    </w:p>
+    <w:p>
+      <w:pPr>
+        <w:rPr>
+          <w:lang w:val="en-IN"/>
+        </w:rPr>
+      </w:pPr>
+      <w:r>
+        <w:rPr>
+          <w:lang w:val="en-IN"/>
+        </w:rPr>
+        <w:t>BMS-SR-006 (Audit logging) → Audit and Notification Service (DS-AUD)</w:t>
+      </w:r>
+    </w:p>
+    <w:p>
+      <w:pPr>
+        <w:rPr>
+          <w:lang w:val="en-IN"/>
+        </w:rPr>
+      </w:pPr>
+      <w:r>
+        <w:rPr>
+          <w:lang w:val="en-IN"/>
+        </w:rPr>
+        <w:t>BMS-SR-007 (Masking and encryption of ID proofs) → Security Layer, Data Access Layer (DS-SEC, DS-DB)</w:t>
+      </w:r>
+    </w:p>
+    <w:p/>
     <w:p>
       <w:pPr>
         <w:pStyle w:val="Heading2"/>
       </w:pPr>
       <w:r>
+        <w:lastRenderedPageBreak/>
         <w:t>3.9 Security Architecture</w:t>
       </w:r>
     </w:p>
@@ -849,7 +1238,6 @@
         <w:pStyle w:val="Heading2"/>
       </w:pPr>
       <w:r>
-        <w:lastRenderedPageBreak/>
         <w:t>4.2 UML Sequence Diagrams</w:t>
       </w:r>
     </w:p>

</xml_diff>

<commit_message>
docs(sad): add security architecture with STRIDE threat model
</commit_message>
<xml_diff>
--- a/docs/sad/SAD_BankManagementSystem_v1.0.docx
+++ b/docs/sad/SAD_BankManagementSystem_v1.0.docx
@@ -1209,7 +1209,15 @@
     </w:p>
     <w:p>
       <w:r>
-        <w:t>Threat Modeling (STRIDE): Spoofing → chip validation; Tampering → secure boot; Info disclosure → TLS; DoS → rate limiting; Elevation of Privilege → RBAC.</w:t>
+        <w:t xml:space="preserve">Threat Modeling (STRIDE): Spoofing → login with hashed passwords, lockout after 3 failed attempts and session timeout; Tampering → </w:t>
+      </w:r>
+      <w:proofErr w:type="spellStart"/>
+      <w:r>
+        <w:t>parameterised</w:t>
+      </w:r>
+      <w:proofErr w:type="spellEnd"/>
+      <w:r>
+        <w:t xml:space="preserve"> queries, input validation and all-or-nothing database transactions; Repudiation → append-only audit log of logins, financial and admin actions; Information disclosure → TLS 1.2+, masked account numbers, encrypted ID-proof numbers and no passwords in logs; DoS → rate limiting and health monitoring; Elevation of Privilege → server-side role-based access control (RBAC) on every request.</w:t>
       </w:r>
     </w:p>
     <w:p>
@@ -1355,6 +1363,7 @@
         <w:pStyle w:val="Heading1"/>
       </w:pPr>
       <w:r>
+        <w:lastRenderedPageBreak/>
         <w:t>5. Appendices</w:t>
       </w:r>
     </w:p>

</xml_diff>

<commit_message>
docs(sad): add design overview and sequence diagrams
</commit_message>
<xml_diff>
--- a/docs/sad/SAD_BankManagementSystem_v1.0.docx
+++ b/docs/sad/SAD_BankManagementSystem_v1.0.docx
@@ -250,31 +250,7 @@
     </w:p>
     <w:p>
       <w:r>
-        <w:t xml:space="preserve">Constraints: single-bank scope with no external payment networks; TLS 1.2+ for client–server traffic (BMS-SR-001); fixed stack (Python 3, </w:t>
-      </w:r>
-      <w:proofErr w:type="spellStart"/>
-      <w:r>
-        <w:t>FastAPI</w:t>
-      </w:r>
-      <w:proofErr w:type="spellEnd"/>
-      <w:r>
-        <w:t xml:space="preserve">, SQLite via </w:t>
-      </w:r>
-      <w:proofErr w:type="spellStart"/>
-      <w:r>
-        <w:t>SQLAlchemy</w:t>
-      </w:r>
-      <w:proofErr w:type="spellEnd"/>
-      <w:r>
-        <w:t xml:space="preserve">, HTML/CSS/JavaScript, </w:t>
-      </w:r>
-      <w:proofErr w:type="spellStart"/>
-      <w:r>
-        <w:t>pytest</w:t>
-      </w:r>
-      <w:proofErr w:type="spellEnd"/>
-      <w:r>
-        <w:t>, GitHub Actions); delivery in two one-week sprints (19–23 Oct and 26–30 Oct 2026).</w:t>
+        <w:t>Constraints: single-bank scope with no external payment networks; TLS 1.2+ for client–server traffic (BMS-SR-001); fixed stack (Python 3, FastAPI, SQLite via SQLAlchemy, HTML/CSS/JavaScript, pytest, GitHub Actions); delivery in two one-week sprints (19–23 Oct and 26–30 Oct 2026).</w:t>
       </w:r>
     </w:p>
     <w:p>
@@ -425,15 +401,7 @@
     </w:p>
     <w:p>
       <w:r>
-        <w:t xml:space="preserve">The system is </w:t>
-      </w:r>
-      <w:proofErr w:type="spellStart"/>
-      <w:r>
-        <w:t>organised</w:t>
-      </w:r>
-      <w:proofErr w:type="spellEnd"/>
-      <w:r>
-        <w:t xml:space="preserve"> in layers. The Web UI calls REST controllers over HTTPS; controllers pass through the Security Layer and delegate to five services; services use a single Data Access Layer; every service reports security-relevant events to the Audit &amp; Notification Service</w:t>
+        <w:t>The system is organised in layers. The Web UI calls REST controllers over HTTPS; controllers pass through the Security Layer and delegate to five services; services use a single Data Access Layer; every service reports security-relevant events to the Audit &amp; Notification Service</w:t>
       </w:r>
       <w:r>
         <w:t>.</w:t>
@@ -613,103 +581,7 @@
           <w:sz w:val="22"/>
           <w:szCs w:val="22"/>
         </w:rPr>
-        <w:t xml:space="preserve">Python 3, </w:t>
-      </w:r>
-      <w:proofErr w:type="spellStart"/>
-      <w:r>
-        <w:rPr>
-          <w:rFonts w:ascii="Cambria" w:eastAsia="Cambria" w:hAnsi="Cambria" w:cs="Cambria"/>
-          <w:b w:val="0"/>
-          <w:bCs w:val="0"/>
-          <w:color w:val="auto"/>
-          <w:sz w:val="22"/>
-          <w:szCs w:val="22"/>
-        </w:rPr>
-        <w:t>FastAPI</w:t>
-      </w:r>
-      <w:proofErr w:type="spellEnd"/>
-      <w:r>
-        <w:rPr>
-          <w:rFonts w:ascii="Cambria" w:eastAsia="Cambria" w:hAnsi="Cambria" w:cs="Cambria"/>
-          <w:b w:val="0"/>
-          <w:bCs w:val="0"/>
-          <w:color w:val="auto"/>
-          <w:sz w:val="22"/>
-          <w:szCs w:val="22"/>
-        </w:rPr>
-        <w:t xml:space="preserve"> REST APIs, SQLite DB (via </w:t>
-      </w:r>
-      <w:proofErr w:type="spellStart"/>
-      <w:r>
-        <w:rPr>
-          <w:rFonts w:ascii="Cambria" w:eastAsia="Cambria" w:hAnsi="Cambria" w:cs="Cambria"/>
-          <w:b w:val="0"/>
-          <w:bCs w:val="0"/>
-          <w:color w:val="auto"/>
-          <w:sz w:val="22"/>
-          <w:szCs w:val="22"/>
-        </w:rPr>
-        <w:t>SQLAlchemy</w:t>
-      </w:r>
-      <w:proofErr w:type="spellEnd"/>
-      <w:r>
-        <w:rPr>
-          <w:rFonts w:ascii="Cambria" w:eastAsia="Cambria" w:hAnsi="Cambria" w:cs="Cambria"/>
-          <w:b w:val="0"/>
-          <w:bCs w:val="0"/>
-          <w:color w:val="auto"/>
-          <w:sz w:val="22"/>
-          <w:szCs w:val="22"/>
-        </w:rPr>
-        <w:t xml:space="preserve">), HTML/CSS/JavaScript web UI, TLS encryption, </w:t>
-      </w:r>
-      <w:proofErr w:type="spellStart"/>
-      <w:r>
-        <w:rPr>
-          <w:rFonts w:ascii="Cambria" w:eastAsia="Cambria" w:hAnsi="Cambria" w:cs="Cambria"/>
-          <w:b w:val="0"/>
-          <w:bCs w:val="0"/>
-          <w:color w:val="auto"/>
-          <w:sz w:val="22"/>
-          <w:szCs w:val="22"/>
-        </w:rPr>
-        <w:t>bcrypt</w:t>
-      </w:r>
-      <w:proofErr w:type="spellEnd"/>
-      <w:r>
-        <w:rPr>
-          <w:rFonts w:ascii="Cambria" w:eastAsia="Cambria" w:hAnsi="Cambria" w:cs="Cambria"/>
-          <w:b w:val="0"/>
-          <w:bCs w:val="0"/>
-          <w:color w:val="auto"/>
-          <w:sz w:val="22"/>
-          <w:szCs w:val="22"/>
-        </w:rPr>
-        <w:t xml:space="preserve"> password hashing, </w:t>
-      </w:r>
-      <w:proofErr w:type="spellStart"/>
-      <w:r>
-        <w:rPr>
-          <w:rFonts w:ascii="Cambria" w:eastAsia="Cambria" w:hAnsi="Cambria" w:cs="Cambria"/>
-          <w:b w:val="0"/>
-          <w:bCs w:val="0"/>
-          <w:color w:val="auto"/>
-          <w:sz w:val="22"/>
-          <w:szCs w:val="22"/>
-        </w:rPr>
-        <w:t>pytest</w:t>
-      </w:r>
-      <w:proofErr w:type="spellEnd"/>
-      <w:r>
-        <w:rPr>
-          <w:rFonts w:ascii="Cambria" w:eastAsia="Cambria" w:hAnsi="Cambria" w:cs="Cambria"/>
-          <w:b w:val="0"/>
-          <w:bCs w:val="0"/>
-          <w:color w:val="auto"/>
-          <w:sz w:val="22"/>
-          <w:szCs w:val="22"/>
-        </w:rPr>
-        <w:t>, GitHub Actions.</w:t>
+        <w:t>Python 3, FastAPI REST APIs, SQLite DB (via SQLAlchemy), HTML/CSS/JavaScript web UI, TLS encryption, bcrypt password hashing, pytest, GitHub Actions.</w:t>
       </w:r>
     </w:p>
     <w:p>
@@ -1209,15 +1081,7 @@
     </w:p>
     <w:p>
       <w:r>
-        <w:t xml:space="preserve">Threat Modeling (STRIDE): Spoofing → login with hashed passwords, lockout after 3 failed attempts and session timeout; Tampering → </w:t>
-      </w:r>
-      <w:proofErr w:type="spellStart"/>
-      <w:r>
-        <w:t>parameterised</w:t>
-      </w:r>
-      <w:proofErr w:type="spellEnd"/>
-      <w:r>
-        <w:t xml:space="preserve"> queries, input validation and all-or-nothing database transactions; Repudiation → append-only audit log of logins, financial and admin actions; Information disclosure → TLS 1.2+, masked account numbers, encrypted ID-proof numbers and no passwords in logs; DoS → rate limiting and health monitoring; Elevation of Privilege → server-side role-based access control (RBAC) on every request.</w:t>
+        <w:t>Threat Modeling (STRIDE): Spoofing → login with hashed passwords, lockout after 3 failed attempts and session timeout; Tampering → parameterised queries, input validation and all-or-nothing database transactions; Repudiation → append-only audit log of logins, financial and admin actions; Information disclosure → TLS 1.2+, masked account numbers, encrypted ID-proof numbers and no passwords in logs; DoS → rate limiting and health monitoring; Elevation of Privilege → server-side role-based access control (RBAC) on every request.</w:t>
       </w:r>
     </w:p>
     <w:p>
@@ -1238,7 +1102,7 @@
     </w:p>
     <w:p>
       <w:r>
-        <w:t>ATM designed with layered modules for separation of concerns and easier maintenance.</w:t>
+        <w:t>BMS is designed with layered modules (API controllers, services, data access) for separation of concerns and easier maintenance. Business rules are implemented in the service layer, and services access the database only through the data access layer.</w:t>
       </w:r>
     </w:p>
     <w:p>
@@ -1251,31 +1115,145 @@
     </w:p>
     <w:p>
       <w:r>
-        <w:t>At least 2 sequence diagrams covering 2 flows specific to your project</w:t>
-      </w:r>
-    </w:p>
-    <w:p>
-      <w:pPr>
-        <w:ind w:left="720" w:firstLine="720"/>
-      </w:pPr>
-      <w:r>
-        <w:t>&lt;&lt;</w:t>
-      </w:r>
-      <w:r>
-        <w:rPr>
-          <w:b/>
-          <w:bCs/>
-        </w:rPr>
-        <w:t xml:space="preserve"> Insert Sequence Diagram here</w:t>
-      </w:r>
-      <w:r>
-        <w:t>&gt;&gt;</w:t>
-      </w:r>
-    </w:p>
-    <w:p>
-      <w:pPr>
-        <w:ind w:left="720" w:firstLine="720"/>
-      </w:pPr>
+        <w:rPr>
+          <w:noProof/>
+        </w:rPr>
+        <w:drawing>
+          <wp:inline distT="0" distB="0" distL="0" distR="0" wp14:anchorId="789644BC" wp14:editId="6EEFCD27">
+            <wp:extent cx="5486400" cy="3867785"/>
+            <wp:effectExtent l="0" t="0" r="0" b="0"/>
+            <wp:docPr id="618574686" name="Picture 3"/>
+            <wp:cNvGraphicFramePr>
+              <a:graphicFrameLocks xmlns:a="http://schemas.openxmlformats.org/drawingml/2006/main" noChangeAspect="1"/>
+            </wp:cNvGraphicFramePr>
+            <a:graphic xmlns:a="http://schemas.openxmlformats.org/drawingml/2006/main">
+              <a:graphicData uri="http://schemas.openxmlformats.org/drawingml/2006/picture">
+                <pic:pic xmlns:pic="http://schemas.openxmlformats.org/drawingml/2006/picture">
+                  <pic:nvPicPr>
+                    <pic:cNvPr id="618574686" name="Picture 618574686"/>
+                    <pic:cNvPicPr/>
+                  </pic:nvPicPr>
+                  <pic:blipFill>
+                    <a:blip r:embed="rId6" cstate="print">
+                      <a:extLst>
+                        <a:ext uri="{28A0092B-C50C-407E-A947-70E740481C1C}">
+                          <a14:useLocalDpi xmlns:a14="http://schemas.microsoft.com/office/drawing/2010/main" val="0"/>
+                        </a:ext>
+                      </a:extLst>
+                    </a:blip>
+                    <a:stretch>
+                      <a:fillRect/>
+                    </a:stretch>
+                  </pic:blipFill>
+                  <pic:spPr>
+                    <a:xfrm>
+                      <a:off x="0" y="0"/>
+                      <a:ext cx="5486400" cy="3867785"/>
+                    </a:xfrm>
+                    <a:prstGeom prst="rect">
+                      <a:avLst/>
+                    </a:prstGeom>
+                  </pic:spPr>
+                </pic:pic>
+              </a:graphicData>
+            </a:graphic>
+          </wp:inline>
+        </w:drawing>
+      </w:r>
+    </w:p>
+    <w:p>
+      <w:pPr>
+        <w:jc w:val="center"/>
+        <w:rPr>
+          <w:i/>
+          <w:iCs/>
+        </w:rPr>
+      </w:pPr>
+      <w:r>
+        <w:rPr>
+          <w:i/>
+          <w:iCs/>
+        </w:rPr>
+        <w:t>Figure 2 - Sequence diagram: Login with account lockout</w:t>
+      </w:r>
+    </w:p>
+    <w:p>
+      <w:r>
+        <w:t>A user submits credentials; the Auth Service checks them, resets or increments the failed-attempt counter, locks the account on the third failure and records an audit event.</w:t>
+      </w:r>
+    </w:p>
+    <w:p>
+      <w:r>
+        <w:rPr>
+          <w:noProof/>
+        </w:rPr>
+        <w:lastRenderedPageBreak/>
+        <w:drawing>
+          <wp:inline distT="0" distB="0" distL="0" distR="0" wp14:anchorId="633A819C" wp14:editId="6D56B35E">
+            <wp:extent cx="5486400" cy="3062605"/>
+            <wp:effectExtent l="0" t="0" r="0" b="4445"/>
+            <wp:docPr id="1605654168" name="Picture 4"/>
+            <wp:cNvGraphicFramePr>
+              <a:graphicFrameLocks xmlns:a="http://schemas.openxmlformats.org/drawingml/2006/main" noChangeAspect="1"/>
+            </wp:cNvGraphicFramePr>
+            <a:graphic xmlns:a="http://schemas.openxmlformats.org/drawingml/2006/main">
+              <a:graphicData uri="http://schemas.openxmlformats.org/drawingml/2006/picture">
+                <pic:pic xmlns:pic="http://schemas.openxmlformats.org/drawingml/2006/picture">
+                  <pic:nvPicPr>
+                    <pic:cNvPr id="1605654168" name="Picture 1605654168"/>
+                    <pic:cNvPicPr/>
+                  </pic:nvPicPr>
+                  <pic:blipFill>
+                    <a:blip r:embed="rId7" cstate="print">
+                      <a:extLst>
+                        <a:ext uri="{28A0092B-C50C-407E-A947-70E740481C1C}">
+                          <a14:useLocalDpi xmlns:a14="http://schemas.microsoft.com/office/drawing/2010/main" val="0"/>
+                        </a:ext>
+                      </a:extLst>
+                    </a:blip>
+                    <a:stretch>
+                      <a:fillRect/>
+                    </a:stretch>
+                  </pic:blipFill>
+                  <pic:spPr>
+                    <a:xfrm>
+                      <a:off x="0" y="0"/>
+                      <a:ext cx="5486400" cy="3062605"/>
+                    </a:xfrm>
+                    <a:prstGeom prst="rect">
+                      <a:avLst/>
+                    </a:prstGeom>
+                  </pic:spPr>
+                </pic:pic>
+              </a:graphicData>
+            </a:graphic>
+          </wp:inline>
+        </w:drawing>
+      </w:r>
+    </w:p>
+    <w:p>
+      <w:pPr>
+        <w:jc w:val="center"/>
+        <w:rPr>
+          <w:i/>
+          <w:iCs/>
+        </w:rPr>
+      </w:pPr>
+      <w:r>
+        <w:rPr>
+          <w:i/>
+          <w:iCs/>
+        </w:rPr>
+        <w:t>Figure 3 - Sequence diagram: Fund transfer</w:t>
+      </w:r>
+    </w:p>
+    <w:p>
+      <w:r>
+        <w:t>A Customer submits a transfer; after authorisation checks the Transaction Service debits and credits both accounts inside one database transaction, commits or rolls back together, then logs the event and sends a notification</w:t>
+      </w:r>
+      <w:r>
+        <w:t>.</w:t>
+      </w:r>
     </w:p>
     <w:p>
       <w:pPr>
@@ -1300,15 +1278,7 @@
       </w:r>
       <w:r>
         <w:br/>
-        <w:t>Request: {</w:t>
-      </w:r>
-      <w:proofErr w:type="spellStart"/>
-      <w:r>
-        <w:t>cardId</w:t>
-      </w:r>
-      <w:proofErr w:type="spellEnd"/>
-      <w:r>
-        <w:t>, pin, amount}</w:t>
+        <w:t>Request: {cardId, pin, amount}</w:t>
       </w:r>
       <w:r>
         <w:br/>
@@ -1377,15 +1347,7 @@
       </w:r>
       <w:r>
         <w:br/>
-        <w:t xml:space="preserve">5.3 Tools: </w:t>
-      </w:r>
-      <w:proofErr w:type="spellStart"/>
-      <w:r>
-        <w:t>PlantUML</w:t>
-      </w:r>
-      <w:proofErr w:type="spellEnd"/>
-      <w:r>
-        <w:t>, draw.io, Swagger.</w:t>
+        <w:t>5.3 Tools: PlantUML, draw.io, Swagger.</w:t>
       </w:r>
     </w:p>
     <w:sectPr>

</xml_diff>

<commit_message>
docs(sad): add API design, error handling, UX design and appendices
</commit_message>
<xml_diff>
--- a/docs/sad/SAD_BankManagementSystem_v1.0.docx
+++ b/docs/sad/SAD_BankManagementSystem_v1.0.docx
@@ -250,7 +250,31 @@
     </w:p>
     <w:p>
       <w:r>
-        <w:t>Constraints: single-bank scope with no external payment networks; TLS 1.2+ for client–server traffic (BMS-SR-001); fixed stack (Python 3, FastAPI, SQLite via SQLAlchemy, HTML/CSS/JavaScript, pytest, GitHub Actions); delivery in two one-week sprints (19–23 Oct and 26–30 Oct 2026).</w:t>
+        <w:t xml:space="preserve">Constraints: single-bank scope with no external payment networks; TLS 1.2+ for client–server traffic (BMS-SR-001); fixed stack (Python 3, </w:t>
+      </w:r>
+      <w:proofErr w:type="spellStart"/>
+      <w:r>
+        <w:t>FastAPI</w:t>
+      </w:r>
+      <w:proofErr w:type="spellEnd"/>
+      <w:r>
+        <w:t xml:space="preserve">, SQLite via </w:t>
+      </w:r>
+      <w:proofErr w:type="spellStart"/>
+      <w:r>
+        <w:t>SQLAlchemy</w:t>
+      </w:r>
+      <w:proofErr w:type="spellEnd"/>
+      <w:r>
+        <w:t xml:space="preserve">, HTML/CSS/JavaScript, </w:t>
+      </w:r>
+      <w:proofErr w:type="spellStart"/>
+      <w:r>
+        <w:t>pytest</w:t>
+      </w:r>
+      <w:proofErr w:type="spellEnd"/>
+      <w:r>
+        <w:t>, GitHub Actions); delivery in two one-week sprints (19–23 Oct and 26–30 Oct 2026).</w:t>
       </w:r>
     </w:p>
     <w:p>
@@ -401,7 +425,23 @@
     </w:p>
     <w:p>
       <w:r>
-        <w:t>The system is organised in layers. The Web UI calls REST controllers over HTTPS; controllers pass through the Security Layer and delegate to five services; services use a single Data Access Layer; every service reports security-relevant events to the Audit &amp; Notification Service</w:t>
+        <w:t xml:space="preserve">The system is </w:t>
+      </w:r>
+      <w:proofErr w:type="spellStart"/>
+      <w:r>
+        <w:t>organised</w:t>
+      </w:r>
+      <w:proofErr w:type="spellEnd"/>
+      <w:r>
+        <w:t xml:space="preserve"> in layers. The Web UI calls REST controllers over HTTPS; controllers pass through the Security Layer and delegate to five services; services use a single Data Access Layer; every service </w:t>
+      </w:r>
+      <w:proofErr w:type="gramStart"/>
+      <w:r>
+        <w:t>reports</w:t>
+      </w:r>
+      <w:proofErr w:type="gramEnd"/>
+      <w:r>
+        <w:t xml:space="preserve"> security-relevant events to the Audit &amp; Notification Service</w:t>
       </w:r>
       <w:r>
         <w:t>.</w:t>
@@ -581,7 +621,103 @@
           <w:sz w:val="22"/>
           <w:szCs w:val="22"/>
         </w:rPr>
-        <w:t>Python 3, FastAPI REST APIs, SQLite DB (via SQLAlchemy), HTML/CSS/JavaScript web UI, TLS encryption, bcrypt password hashing, pytest, GitHub Actions.</w:t>
+        <w:t xml:space="preserve">Python 3, </w:t>
+      </w:r>
+      <w:proofErr w:type="spellStart"/>
+      <w:r>
+        <w:rPr>
+          <w:rFonts w:ascii="Cambria" w:eastAsia="Cambria" w:hAnsi="Cambria" w:cs="Cambria"/>
+          <w:b w:val="0"/>
+          <w:bCs w:val="0"/>
+          <w:color w:val="auto"/>
+          <w:sz w:val="22"/>
+          <w:szCs w:val="22"/>
+        </w:rPr>
+        <w:t>FastAPI</w:t>
+      </w:r>
+      <w:proofErr w:type="spellEnd"/>
+      <w:r>
+        <w:rPr>
+          <w:rFonts w:ascii="Cambria" w:eastAsia="Cambria" w:hAnsi="Cambria" w:cs="Cambria"/>
+          <w:b w:val="0"/>
+          <w:bCs w:val="0"/>
+          <w:color w:val="auto"/>
+          <w:sz w:val="22"/>
+          <w:szCs w:val="22"/>
+        </w:rPr>
+        <w:t xml:space="preserve"> REST APIs, SQLite DB (via </w:t>
+      </w:r>
+      <w:proofErr w:type="spellStart"/>
+      <w:r>
+        <w:rPr>
+          <w:rFonts w:ascii="Cambria" w:eastAsia="Cambria" w:hAnsi="Cambria" w:cs="Cambria"/>
+          <w:b w:val="0"/>
+          <w:bCs w:val="0"/>
+          <w:color w:val="auto"/>
+          <w:sz w:val="22"/>
+          <w:szCs w:val="22"/>
+        </w:rPr>
+        <w:t>SQLAlchemy</w:t>
+      </w:r>
+      <w:proofErr w:type="spellEnd"/>
+      <w:r>
+        <w:rPr>
+          <w:rFonts w:ascii="Cambria" w:eastAsia="Cambria" w:hAnsi="Cambria" w:cs="Cambria"/>
+          <w:b w:val="0"/>
+          <w:bCs w:val="0"/>
+          <w:color w:val="auto"/>
+          <w:sz w:val="22"/>
+          <w:szCs w:val="22"/>
+        </w:rPr>
+        <w:t xml:space="preserve">), HTML/CSS/JavaScript web UI, TLS encryption, </w:t>
+      </w:r>
+      <w:proofErr w:type="spellStart"/>
+      <w:r>
+        <w:rPr>
+          <w:rFonts w:ascii="Cambria" w:eastAsia="Cambria" w:hAnsi="Cambria" w:cs="Cambria"/>
+          <w:b w:val="0"/>
+          <w:bCs w:val="0"/>
+          <w:color w:val="auto"/>
+          <w:sz w:val="22"/>
+          <w:szCs w:val="22"/>
+        </w:rPr>
+        <w:t>bcrypt</w:t>
+      </w:r>
+      <w:proofErr w:type="spellEnd"/>
+      <w:r>
+        <w:rPr>
+          <w:rFonts w:ascii="Cambria" w:eastAsia="Cambria" w:hAnsi="Cambria" w:cs="Cambria"/>
+          <w:b w:val="0"/>
+          <w:bCs w:val="0"/>
+          <w:color w:val="auto"/>
+          <w:sz w:val="22"/>
+          <w:szCs w:val="22"/>
+        </w:rPr>
+        <w:t xml:space="preserve"> password hashing, </w:t>
+      </w:r>
+      <w:proofErr w:type="spellStart"/>
+      <w:r>
+        <w:rPr>
+          <w:rFonts w:ascii="Cambria" w:eastAsia="Cambria" w:hAnsi="Cambria" w:cs="Cambria"/>
+          <w:b w:val="0"/>
+          <w:bCs w:val="0"/>
+          <w:color w:val="auto"/>
+          <w:sz w:val="22"/>
+          <w:szCs w:val="22"/>
+        </w:rPr>
+        <w:t>pytest</w:t>
+      </w:r>
+      <w:proofErr w:type="spellEnd"/>
+      <w:r>
+        <w:rPr>
+          <w:rFonts w:ascii="Cambria" w:eastAsia="Cambria" w:hAnsi="Cambria" w:cs="Cambria"/>
+          <w:b w:val="0"/>
+          <w:bCs w:val="0"/>
+          <w:color w:val="auto"/>
+          <w:sz w:val="22"/>
+          <w:szCs w:val="22"/>
+        </w:rPr>
+        <w:t>, GitHub Actions.</w:t>
       </w:r>
     </w:p>
     <w:p>
@@ -1081,7 +1217,15 @@
     </w:p>
     <w:p>
       <w:r>
-        <w:t>Threat Modeling (STRIDE): Spoofing → login with hashed passwords, lockout after 3 failed attempts and session timeout; Tampering → parameterised queries, input validation and all-or-nothing database transactions; Repudiation → append-only audit log of logins, financial and admin actions; Information disclosure → TLS 1.2+, masked account numbers, encrypted ID-proof numbers and no passwords in logs; DoS → rate limiting and health monitoring; Elevation of Privilege → server-side role-based access control (RBAC) on every request.</w:t>
+        <w:t xml:space="preserve">Threat Modeling (STRIDE): Spoofing → login with hashed passwords, lockout after 3 failed attempts and session timeout; Tampering → </w:t>
+      </w:r>
+      <w:proofErr w:type="spellStart"/>
+      <w:r>
+        <w:t>parameterised</w:t>
+      </w:r>
+      <w:proofErr w:type="spellEnd"/>
+      <w:r>
+        <w:t xml:space="preserve"> queries, input validation and all-or-nothing database transactions; Repudiation → append-only audit log of logins, financial and admin actions; Information disclosure → TLS 1.2+, masked account numbers, encrypted ID-proof numbers and no passwords in logs; DoS → rate limiting and health monitoring; Elevation of Privilege → server-side role-based access control (RBAC) on every request.</w:t>
       </w:r>
     </w:p>
     <w:p>
@@ -1249,7 +1393,15 @@
     </w:p>
     <w:p>
       <w:r>
-        <w:t>A Customer submits a transfer; after authorisation checks the Transaction Service debits and credits both accounts inside one database transaction, commits or rolls back together, then logs the event and sends a notification</w:t>
+        <w:t xml:space="preserve">A Customer submits a transfer; after </w:t>
+      </w:r>
+      <w:proofErr w:type="spellStart"/>
+      <w:r>
+        <w:t>authorisation</w:t>
+      </w:r>
+      <w:proofErr w:type="spellEnd"/>
+      <w:r>
+        <w:t xml:space="preserve"> checks the Transaction Service debits and credits both accounts inside one database transaction, commits or rolls back together, then logs the event and sends a notification</w:t>
       </w:r>
       <w:r>
         <w:t>.</w:t>
@@ -1263,43 +1415,638 @@
         <w:t>4.3 API Design</w:t>
       </w:r>
     </w:p>
-    <w:p>
-      <w:r>
-        <w:t>Interface definition for at least 2 components.</w:t>
-      </w:r>
-    </w:p>
-    <w:p>
-      <w:r>
-        <w:t>Endpoint: /withdraw</w:t>
-      </w:r>
-      <w:r>
-        <w:br/>
+    <w:p/>
+    <w:p>
+      <w:pPr>
+        <w:rPr>
+          <w:lang w:val="en-IN"/>
+        </w:rPr>
+      </w:pPr>
+      <w:r>
+        <w:rPr>
+          <w:lang w:val="en-IN"/>
+        </w:rPr>
+        <w:t>Endpoint: /auth/login</w:t>
+      </w:r>
+    </w:p>
+    <w:p>
+      <w:pPr>
+        <w:rPr>
+          <w:lang w:val="en-IN"/>
+        </w:rPr>
+      </w:pPr>
+      <w:r>
+        <w:rPr>
+          <w:lang w:val="en-IN"/>
+        </w:rPr>
         <w:t>Method: POST</w:t>
       </w:r>
-      <w:r>
-        <w:br/>
-        <w:t>Request: {cardId, pin, amount}</w:t>
-      </w:r>
-      <w:r>
-        <w:br/>
-        <w:t>Response: {status, balance}</w:t>
-      </w:r>
-      <w:r>
-        <w:br/>
-        <w:t>Errors: 401 Invalid PIN, 402 Insufficient funds.</w:t>
-      </w:r>
-    </w:p>
+    </w:p>
+    <w:p>
+      <w:pPr>
+        <w:rPr>
+          <w:lang w:val="en-IN"/>
+        </w:rPr>
+      </w:pPr>
+      <w:r>
+        <w:rPr>
+          <w:lang w:val="en-IN"/>
+        </w:rPr>
+        <w:t>Request: {username, password}</w:t>
+      </w:r>
+    </w:p>
+    <w:p>
+      <w:pPr>
+        <w:rPr>
+          <w:lang w:val="en-IN"/>
+        </w:rPr>
+      </w:pPr>
+      <w:r>
+        <w:rPr>
+          <w:lang w:val="en-IN"/>
+        </w:rPr>
+        <w:t xml:space="preserve">Response: {token, role, </w:t>
+      </w:r>
+      <w:proofErr w:type="spellStart"/>
+      <w:r>
+        <w:rPr>
+          <w:lang w:val="en-IN"/>
+        </w:rPr>
+        <w:t>mustChangePassword</w:t>
+      </w:r>
+      <w:proofErr w:type="spellEnd"/>
+      <w:r>
+        <w:rPr>
+          <w:lang w:val="en-IN"/>
+        </w:rPr>
+        <w:t>}</w:t>
+      </w:r>
+    </w:p>
+    <w:p>
+      <w:pPr>
+        <w:rPr>
+          <w:lang w:val="en-IN"/>
+        </w:rPr>
+      </w:pPr>
+      <w:r>
+        <w:rPr>
+          <w:lang w:val="en-IN"/>
+        </w:rPr>
+        <w:t>Errors: 401 Invalid credentials, 423 Account locked.</w:t>
+      </w:r>
+    </w:p>
+    <w:p>
+      <w:pPr>
+        <w:rPr>
+          <w:lang w:val="en-IN"/>
+        </w:rPr>
+      </w:pPr>
+      <w:r>
+        <w:rPr>
+          <w:lang w:val="en-IN"/>
+        </w:rPr>
+        <w:t> </w:t>
+      </w:r>
+    </w:p>
+    <w:p>
+      <w:pPr>
+        <w:rPr>
+          <w:lang w:val="en-IN"/>
+        </w:rPr>
+      </w:pPr>
+      <w:r>
+        <w:rPr>
+          <w:lang w:val="en-IN"/>
+        </w:rPr>
+        <w:t>Endpoint: /auth/logout</w:t>
+      </w:r>
+    </w:p>
+    <w:p>
+      <w:pPr>
+        <w:rPr>
+          <w:lang w:val="en-IN"/>
+        </w:rPr>
+      </w:pPr>
+      <w:r>
+        <w:rPr>
+          <w:lang w:val="en-IN"/>
+        </w:rPr>
+        <w:t>Method: POST</w:t>
+      </w:r>
+    </w:p>
+    <w:p>
+      <w:pPr>
+        <w:rPr>
+          <w:lang w:val="en-IN"/>
+        </w:rPr>
+      </w:pPr>
+      <w:r>
+        <w:rPr>
+          <w:lang w:val="en-IN"/>
+        </w:rPr>
+        <w:t>Request: session token in header</w:t>
+      </w:r>
+    </w:p>
+    <w:p>
+      <w:pPr>
+        <w:rPr>
+          <w:lang w:val="en-IN"/>
+        </w:rPr>
+      </w:pPr>
+      <w:r>
+        <w:rPr>
+          <w:lang w:val="en-IN"/>
+        </w:rPr>
+        <w:t>Response: {status}</w:t>
+      </w:r>
+    </w:p>
+    <w:p>
+      <w:pPr>
+        <w:rPr>
+          <w:lang w:val="en-IN"/>
+        </w:rPr>
+      </w:pPr>
+      <w:r>
+        <w:rPr>
+          <w:lang w:val="en-IN"/>
+        </w:rPr>
+        <w:t>Errors: 401 Invalid or expired session.</w:t>
+      </w:r>
+    </w:p>
+    <w:p>
+      <w:pPr>
+        <w:rPr>
+          <w:lang w:val="en-IN"/>
+        </w:rPr>
+      </w:pPr>
+      <w:r>
+        <w:rPr>
+          <w:lang w:val="en-IN"/>
+        </w:rPr>
+        <w:lastRenderedPageBreak/>
+        <w:t> </w:t>
+      </w:r>
+    </w:p>
+    <w:p>
+      <w:pPr>
+        <w:rPr>
+          <w:lang w:val="en-IN"/>
+        </w:rPr>
+      </w:pPr>
+      <w:r>
+        <w:rPr>
+          <w:lang w:val="en-IN"/>
+        </w:rPr>
+        <w:t>Endpoint: /auth/password</w:t>
+      </w:r>
+    </w:p>
+    <w:p>
+      <w:pPr>
+        <w:rPr>
+          <w:lang w:val="en-IN"/>
+        </w:rPr>
+      </w:pPr>
+      <w:r>
+        <w:rPr>
+          <w:lang w:val="en-IN"/>
+        </w:rPr>
+        <w:t>Method: PUT</w:t>
+      </w:r>
+    </w:p>
+    <w:p>
+      <w:pPr>
+        <w:rPr>
+          <w:lang w:val="en-IN"/>
+        </w:rPr>
+      </w:pPr>
+      <w:r>
+        <w:rPr>
+          <w:lang w:val="en-IN"/>
+        </w:rPr>
+        <w:t>Request: {</w:t>
+      </w:r>
+      <w:proofErr w:type="spellStart"/>
+      <w:r>
+        <w:rPr>
+          <w:lang w:val="en-IN"/>
+        </w:rPr>
+        <w:t>currentPassword</w:t>
+      </w:r>
+      <w:proofErr w:type="spellEnd"/>
+      <w:r>
+        <w:rPr>
+          <w:lang w:val="en-IN"/>
+        </w:rPr>
+        <w:t xml:space="preserve">, </w:t>
+      </w:r>
+      <w:proofErr w:type="spellStart"/>
+      <w:r>
+        <w:rPr>
+          <w:lang w:val="en-IN"/>
+        </w:rPr>
+        <w:t>newPassword</w:t>
+      </w:r>
+      <w:proofErr w:type="spellEnd"/>
+      <w:r>
+        <w:rPr>
+          <w:lang w:val="en-IN"/>
+        </w:rPr>
+        <w:t>}</w:t>
+      </w:r>
+    </w:p>
+    <w:p>
+      <w:pPr>
+        <w:rPr>
+          <w:lang w:val="en-IN"/>
+        </w:rPr>
+      </w:pPr>
+      <w:r>
+        <w:rPr>
+          <w:lang w:val="en-IN"/>
+        </w:rPr>
+        <w:t>Response: {status}</w:t>
+      </w:r>
+    </w:p>
+    <w:p>
+      <w:pPr>
+        <w:rPr>
+          <w:lang w:val="en-IN"/>
+        </w:rPr>
+      </w:pPr>
+      <w:r>
+        <w:rPr>
+          <w:lang w:val="en-IN"/>
+        </w:rPr>
+        <w:t>Errors: 400 Weak password, 401 Wrong current password.</w:t>
+      </w:r>
+    </w:p>
+    <w:p>
+      <w:pPr>
+        <w:rPr>
+          <w:lang w:val="en-IN"/>
+        </w:rPr>
+      </w:pPr>
+      <w:r>
+        <w:rPr>
+          <w:lang w:val="en-IN"/>
+        </w:rPr>
+        <w:t> </w:t>
+      </w:r>
+    </w:p>
+    <w:p>
+      <w:pPr>
+        <w:rPr>
+          <w:lang w:val="en-IN"/>
+        </w:rPr>
+      </w:pPr>
+      <w:r>
+        <w:rPr>
+          <w:lang w:val="en-IN"/>
+        </w:rPr>
+        <w:t>Endpoint: /transactions/deposit</w:t>
+      </w:r>
+    </w:p>
+    <w:p>
+      <w:pPr>
+        <w:rPr>
+          <w:lang w:val="en-IN"/>
+        </w:rPr>
+      </w:pPr>
+      <w:r>
+        <w:rPr>
+          <w:lang w:val="en-IN"/>
+        </w:rPr>
+        <w:t>Method: POST</w:t>
+      </w:r>
+    </w:p>
+    <w:p>
+      <w:pPr>
+        <w:rPr>
+          <w:lang w:val="en-IN"/>
+        </w:rPr>
+      </w:pPr>
+      <w:r>
+        <w:rPr>
+          <w:lang w:val="en-IN"/>
+        </w:rPr>
+        <w:t>Request: {</w:t>
+      </w:r>
+      <w:proofErr w:type="spellStart"/>
+      <w:r>
+        <w:rPr>
+          <w:lang w:val="en-IN"/>
+        </w:rPr>
+        <w:t>accountId</w:t>
+      </w:r>
+      <w:proofErr w:type="spellEnd"/>
+      <w:r>
+        <w:rPr>
+          <w:lang w:val="en-IN"/>
+        </w:rPr>
+        <w:t>, amount}</w:t>
+      </w:r>
+    </w:p>
+    <w:p>
+      <w:pPr>
+        <w:rPr>
+          <w:lang w:val="en-IN"/>
+        </w:rPr>
+      </w:pPr>
+      <w:r>
+        <w:rPr>
+          <w:lang w:val="en-IN"/>
+        </w:rPr>
+        <w:t>Response: {</w:t>
+      </w:r>
+      <w:proofErr w:type="spellStart"/>
+      <w:r>
+        <w:rPr>
+          <w:lang w:val="en-IN"/>
+        </w:rPr>
+        <w:t>transactionId</w:t>
+      </w:r>
+      <w:proofErr w:type="spellEnd"/>
+      <w:r>
+        <w:rPr>
+          <w:lang w:val="en-IN"/>
+        </w:rPr>
+        <w:t xml:space="preserve">, </w:t>
+      </w:r>
+      <w:proofErr w:type="spellStart"/>
+      <w:r>
+        <w:rPr>
+          <w:lang w:val="en-IN"/>
+        </w:rPr>
+        <w:t>receiptNo</w:t>
+      </w:r>
+      <w:proofErr w:type="spellEnd"/>
+      <w:r>
+        <w:rPr>
+          <w:lang w:val="en-IN"/>
+        </w:rPr>
+        <w:t>, balance}</w:t>
+      </w:r>
+    </w:p>
+    <w:p>
+      <w:pPr>
+        <w:rPr>
+          <w:lang w:val="en-IN"/>
+        </w:rPr>
+      </w:pPr>
+      <w:r>
+        <w:rPr>
+          <w:lang w:val="en-IN"/>
+        </w:rPr>
+        <w:t>Errors: 400 Invalid amount, 403 Forbidden, 409 Account frozen or closed.</w:t>
+      </w:r>
+    </w:p>
+    <w:p>
+      <w:pPr>
+        <w:rPr>
+          <w:lang w:val="en-IN"/>
+        </w:rPr>
+      </w:pPr>
+      <w:r>
+        <w:rPr>
+          <w:lang w:val="en-IN"/>
+        </w:rPr>
+        <w:t> </w:t>
+      </w:r>
+    </w:p>
+    <w:p>
+      <w:pPr>
+        <w:rPr>
+          <w:lang w:val="en-IN"/>
+        </w:rPr>
+      </w:pPr>
+      <w:r>
+        <w:rPr>
+          <w:lang w:val="en-IN"/>
+        </w:rPr>
+        <w:t>Endpoint: /transactions/withdraw</w:t>
+      </w:r>
+    </w:p>
+    <w:p>
+      <w:pPr>
+        <w:rPr>
+          <w:lang w:val="en-IN"/>
+        </w:rPr>
+      </w:pPr>
+      <w:r>
+        <w:rPr>
+          <w:lang w:val="en-IN"/>
+        </w:rPr>
+        <w:t>Method: POST</w:t>
+      </w:r>
+    </w:p>
+    <w:p>
+      <w:pPr>
+        <w:rPr>
+          <w:lang w:val="en-IN"/>
+        </w:rPr>
+      </w:pPr>
+      <w:r>
+        <w:rPr>
+          <w:lang w:val="en-IN"/>
+        </w:rPr>
+        <w:t>Request: {</w:t>
+      </w:r>
+      <w:proofErr w:type="spellStart"/>
+      <w:r>
+        <w:rPr>
+          <w:lang w:val="en-IN"/>
+        </w:rPr>
+        <w:t>accountId</w:t>
+      </w:r>
+      <w:proofErr w:type="spellEnd"/>
+      <w:r>
+        <w:rPr>
+          <w:lang w:val="en-IN"/>
+        </w:rPr>
+        <w:t>, amount}</w:t>
+      </w:r>
+    </w:p>
+    <w:p>
+      <w:pPr>
+        <w:rPr>
+          <w:lang w:val="en-IN"/>
+        </w:rPr>
+      </w:pPr>
+      <w:r>
+        <w:rPr>
+          <w:lang w:val="en-IN"/>
+        </w:rPr>
+        <w:t>Response: {</w:t>
+      </w:r>
+      <w:proofErr w:type="spellStart"/>
+      <w:r>
+        <w:rPr>
+          <w:lang w:val="en-IN"/>
+        </w:rPr>
+        <w:t>transactionId</w:t>
+      </w:r>
+      <w:proofErr w:type="spellEnd"/>
+      <w:r>
+        <w:rPr>
+          <w:lang w:val="en-IN"/>
+        </w:rPr>
+        <w:t>, balance}</w:t>
+      </w:r>
+    </w:p>
+    <w:p>
+      <w:pPr>
+        <w:rPr>
+          <w:lang w:val="en-IN"/>
+        </w:rPr>
+      </w:pPr>
+      <w:r>
+        <w:rPr>
+          <w:lang w:val="en-IN"/>
+        </w:rPr>
+        <w:t>Errors: 403 Forbidden, 409 Account frozen or closed, 422 Insufficient funds or daily limit exceeded.</w:t>
+      </w:r>
+    </w:p>
+    <w:p>
+      <w:pPr>
+        <w:rPr>
+          <w:lang w:val="en-IN"/>
+        </w:rPr>
+      </w:pPr>
+      <w:r>
+        <w:rPr>
+          <w:lang w:val="en-IN"/>
+        </w:rPr>
+        <w:t> </w:t>
+      </w:r>
+    </w:p>
+    <w:p>
+      <w:pPr>
+        <w:rPr>
+          <w:lang w:val="en-IN"/>
+        </w:rPr>
+      </w:pPr>
+      <w:r>
+        <w:rPr>
+          <w:lang w:val="en-IN"/>
+        </w:rPr>
+        <w:t>Endpoint: /transactions/transfer</w:t>
+      </w:r>
+    </w:p>
+    <w:p>
+      <w:pPr>
+        <w:rPr>
+          <w:lang w:val="en-IN"/>
+        </w:rPr>
+      </w:pPr>
+      <w:r>
+        <w:rPr>
+          <w:lang w:val="en-IN"/>
+        </w:rPr>
+        <w:t>Method: POST</w:t>
+      </w:r>
+    </w:p>
+    <w:p>
+      <w:pPr>
+        <w:rPr>
+          <w:lang w:val="en-IN"/>
+        </w:rPr>
+      </w:pPr>
+      <w:r>
+        <w:rPr>
+          <w:lang w:val="en-IN"/>
+        </w:rPr>
+        <w:t>Request: {</w:t>
+      </w:r>
+      <w:proofErr w:type="spellStart"/>
+      <w:r>
+        <w:rPr>
+          <w:lang w:val="en-IN"/>
+        </w:rPr>
+        <w:t>fromAccount</w:t>
+      </w:r>
+      <w:proofErr w:type="spellEnd"/>
+      <w:r>
+        <w:rPr>
+          <w:lang w:val="en-IN"/>
+        </w:rPr>
+        <w:t xml:space="preserve">, </w:t>
+      </w:r>
+      <w:proofErr w:type="spellStart"/>
+      <w:r>
+        <w:rPr>
+          <w:lang w:val="en-IN"/>
+        </w:rPr>
+        <w:t>toAccount</w:t>
+      </w:r>
+      <w:proofErr w:type="spellEnd"/>
+      <w:r>
+        <w:rPr>
+          <w:lang w:val="en-IN"/>
+        </w:rPr>
+        <w:t>, amount}</w:t>
+      </w:r>
+    </w:p>
+    <w:p>
+      <w:pPr>
+        <w:rPr>
+          <w:lang w:val="en-IN"/>
+        </w:rPr>
+      </w:pPr>
+      <w:r>
+        <w:rPr>
+          <w:lang w:val="en-IN"/>
+        </w:rPr>
+        <w:t xml:space="preserve">Response: {status, </w:t>
+      </w:r>
+      <w:proofErr w:type="spellStart"/>
+      <w:r>
+        <w:rPr>
+          <w:lang w:val="en-IN"/>
+        </w:rPr>
+        <w:t>transactionId</w:t>
+      </w:r>
+      <w:proofErr w:type="spellEnd"/>
+      <w:r>
+        <w:rPr>
+          <w:lang w:val="en-IN"/>
+        </w:rPr>
+        <w:t>, balance}</w:t>
+      </w:r>
+    </w:p>
+    <w:p>
+      <w:pPr>
+        <w:rPr>
+          <w:lang w:val="en-IN"/>
+        </w:rPr>
+      </w:pPr>
+      <w:r>
+        <w:rPr>
+          <w:lang w:val="en-IN"/>
+        </w:rPr>
+        <w:t>Errors: 403 Forbidden, 409 Account frozen or closed, 422 Insufficient funds or transfer limit exceeded.</w:t>
+      </w:r>
+    </w:p>
+    <w:p/>
     <w:p>
       <w:pPr>
         <w:pStyle w:val="Heading2"/>
       </w:pPr>
       <w:r>
+        <w:lastRenderedPageBreak/>
         <w:t>4.4 Error Handling, Logging &amp; Monitoring</w:t>
       </w:r>
     </w:p>
     <w:p>
       <w:r>
-        <w:t>Standardized error messages. No sensitive info in logs. Monitoring includes transaction failure rate, ATM uptime.</w:t>
+        <w:t xml:space="preserve">Standardized error messages in one JSON format {code, message, timestamp, </w:t>
+      </w:r>
+      <w:proofErr w:type="spellStart"/>
+      <w:r>
+        <w:t>traceId</w:t>
+      </w:r>
+      <w:proofErr w:type="spellEnd"/>
+      <w:r>
+        <w:t>}. No sensitive info in logs (no passwords, account numbers masked). Monitoring includes transaction failure rate, login failure count and system uptime through a /health endpoint.</w:t>
       </w:r>
     </w:p>
     <w:p>
@@ -1312,7 +2059,15 @@
     </w:p>
     <w:p>
       <w:r>
-        <w:t>ATM UI with accessible font sizes, language selection, and voice assistance.</w:t>
+        <w:t xml:space="preserve">Web UI with accessible font sizes, clear error messages, a responsive layout that works down to 360 </w:t>
+      </w:r>
+      <w:proofErr w:type="spellStart"/>
+      <w:r>
+        <w:t>px</w:t>
+      </w:r>
+      <w:proofErr w:type="spellEnd"/>
+      <w:r>
+        <w:t>, and a confirmation step before money is moved. Separate screens for Customer, Teller and Admin.</w:t>
       </w:r>
     </w:p>
     <w:p>
@@ -1325,7 +2080,7 @@
     </w:p>
     <w:p>
       <w:r>
-        <w:t>Future enhancements: biometric authentication, QR-based mobile withdrawals.</w:t>
+        <w:t>Future enhancements: multi-factor authentication, mobile app, real e-mail/SMS notification gateway, migration to PostgreSQL or MySQL.</w:t>
       </w:r>
     </w:p>
     <w:p>
@@ -1333,23 +2088,63 @@
         <w:pStyle w:val="Heading1"/>
       </w:pPr>
       <w:r>
-        <w:lastRenderedPageBreak/>
         <w:t>5. Appendices</w:t>
       </w:r>
     </w:p>
     <w:p>
-      <w:r>
-        <w:t>5.1 Glossary: ATM, PIN, PCI-DSS, TLS, ADR.</w:t>
-      </w:r>
-      <w:r>
-        <w:br/>
+      <w:pPr>
+        <w:rPr>
+          <w:lang w:val="en-IN"/>
+        </w:rPr>
+      </w:pPr>
+      <w:r>
+        <w:rPr>
+          <w:lang w:val="en-IN"/>
+        </w:rPr>
+        <w:t>5.1 Glossary: BMS, RBAC, REST, JWT, ACID, DAO, STRIDE, TLS, ADR.</w:t>
+      </w:r>
+    </w:p>
+    <w:p>
+      <w:pPr>
+        <w:rPr>
+          <w:lang w:val="en-IN"/>
+        </w:rPr>
+      </w:pPr>
+      <w:r>
+        <w:rPr>
+          <w:lang w:val="en-IN"/>
+        </w:rPr>
         <w:t>5.2 References: IEEE 42010, OWASP, NIST SP 800-160.</w:t>
       </w:r>
-      <w:r>
-        <w:br/>
-        <w:t>5.3 Tools: PlantUML, draw.io, Swagger.</w:t>
-      </w:r>
-    </w:p>
+    </w:p>
+    <w:p>
+      <w:pPr>
+        <w:rPr>
+          <w:lang w:val="en-IN"/>
+        </w:rPr>
+      </w:pPr>
+      <w:r>
+        <w:rPr>
+          <w:lang w:val="en-IN"/>
+        </w:rPr>
+        <w:t xml:space="preserve">5.3 Tools: </w:t>
+      </w:r>
+      <w:proofErr w:type="spellStart"/>
+      <w:r>
+        <w:rPr>
+          <w:lang w:val="en-IN"/>
+        </w:rPr>
+        <w:t>PlantUML</w:t>
+      </w:r>
+      <w:proofErr w:type="spellEnd"/>
+      <w:r>
+        <w:rPr>
+          <w:lang w:val="en-IN"/>
+        </w:rPr>
+        <w:t>, draw.io, Postman.</w:t>
+      </w:r>
+    </w:p>
+    <w:p/>
     <w:sectPr>
       <w:pgSz w:w="12240" w:h="15840"/>
       <w:pgMar w:top="1440" w:right="1800" w:bottom="1440" w:left="1800" w:header="720" w:footer="720" w:gutter="0"/>

</xml_diff>

<commit_message>
docs(sad): fix minor formatting
</commit_message>
<xml_diff>
--- a/docs/sad/SAD_BankManagementSystem_v1.0.docx
+++ b/docs/sad/SAD_BankManagementSystem_v1.0.docx
@@ -152,6 +152,9 @@
       </w:r>
       <w:r>
         <w:t>This document specifies the architecture and design of the Bank Management System (BMS), a web application for managing bank accounts and money movement within a single bank</w:t>
+      </w:r>
+      <w:r>
+        <w:t>.</w:t>
       </w:r>
     </w:p>
     <w:p>
@@ -250,34 +253,13 @@
     </w:p>
     <w:p>
       <w:r>
-        <w:t xml:space="preserve">Constraints: single-bank scope with no external payment networks; TLS 1.2+ for client–server traffic (BMS-SR-001); fixed stack (Python 3, </w:t>
-      </w:r>
-      <w:proofErr w:type="spellStart"/>
-      <w:r>
-        <w:t>FastAPI</w:t>
-      </w:r>
-      <w:proofErr w:type="spellEnd"/>
-      <w:r>
-        <w:t xml:space="preserve">, SQLite via </w:t>
-      </w:r>
-      <w:proofErr w:type="spellStart"/>
-      <w:r>
-        <w:t>SQLAlchemy</w:t>
-      </w:r>
-      <w:proofErr w:type="spellEnd"/>
-      <w:r>
-        <w:t xml:space="preserve">, HTML/CSS/JavaScript, </w:t>
-      </w:r>
-      <w:proofErr w:type="spellStart"/>
-      <w:r>
-        <w:t>pytest</w:t>
-      </w:r>
-      <w:proofErr w:type="spellEnd"/>
-      <w:r>
-        <w:t>, GitHub Actions); delivery in two one-week sprints (19–23 Oct and 26–30 Oct 2026).</w:t>
-      </w:r>
-    </w:p>
-    <w:p>
+        <w:t>Constraints: single-bank scope with no external payment networks; TLS 1.2+ for client–server traffic (BMS-SR-001); fixed stack (Python 3, FastAPI, SQLite via SQLAlchemy, HTML/CSS/JavaScript, pytest, GitHub Actions); delivery in two one-week sprints (19–23 Oct and 26–30 Oct 2026).</w:t>
+      </w:r>
+    </w:p>
+    <w:p>
+      <w:pPr>
+        <w:spacing w:after="0"/>
+      </w:pPr>
       <w:r>
         <w:rPr>
           <w:rFonts w:ascii="Calibri" w:eastAsia="Calibri" w:hAnsi="Calibri" w:cs="Calibri"/>
@@ -310,6 +292,9 @@
       </w:r>
     </w:p>
     <w:p>
+      <w:pPr>
+        <w:spacing w:after="0"/>
+      </w:pPr>
       <w:r>
         <w:t>Admin/Branch Manager: Control of staff access, audit trails, reports</w:t>
       </w:r>
@@ -425,23 +410,7 @@
     </w:p>
     <w:p>
       <w:r>
-        <w:t xml:space="preserve">The system is </w:t>
-      </w:r>
-      <w:proofErr w:type="spellStart"/>
-      <w:r>
-        <w:t>organised</w:t>
-      </w:r>
-      <w:proofErr w:type="spellEnd"/>
-      <w:r>
-        <w:t xml:space="preserve"> in layers. The Web UI calls REST controllers over HTTPS; controllers pass through the Security Layer and delegate to five services; services use a single Data Access Layer; every service </w:t>
-      </w:r>
-      <w:proofErr w:type="gramStart"/>
-      <w:r>
-        <w:t>reports</w:t>
-      </w:r>
-      <w:proofErr w:type="gramEnd"/>
-      <w:r>
-        <w:t xml:space="preserve"> security-relevant events to the Audit &amp; Notification Service</w:t>
+        <w:t>The system is organised in layers. The Web UI calls REST controllers over HTTPS; controllers pass through the Security Layer and delegate to five services; services use a single Data Access Layer; every service reports security-relevant events to the Audit &amp; Notification Service</w:t>
       </w:r>
       <w:r>
         <w:t>.</w:t>
@@ -621,103 +590,7 @@
           <w:sz w:val="22"/>
           <w:szCs w:val="22"/>
         </w:rPr>
-        <w:t xml:space="preserve">Python 3, </w:t>
-      </w:r>
-      <w:proofErr w:type="spellStart"/>
-      <w:r>
-        <w:rPr>
-          <w:rFonts w:ascii="Cambria" w:eastAsia="Cambria" w:hAnsi="Cambria" w:cs="Cambria"/>
-          <w:b w:val="0"/>
-          <w:bCs w:val="0"/>
-          <w:color w:val="auto"/>
-          <w:sz w:val="22"/>
-          <w:szCs w:val="22"/>
-        </w:rPr>
-        <w:t>FastAPI</w:t>
-      </w:r>
-      <w:proofErr w:type="spellEnd"/>
-      <w:r>
-        <w:rPr>
-          <w:rFonts w:ascii="Cambria" w:eastAsia="Cambria" w:hAnsi="Cambria" w:cs="Cambria"/>
-          <w:b w:val="0"/>
-          <w:bCs w:val="0"/>
-          <w:color w:val="auto"/>
-          <w:sz w:val="22"/>
-          <w:szCs w:val="22"/>
-        </w:rPr>
-        <w:t xml:space="preserve"> REST APIs, SQLite DB (via </w:t>
-      </w:r>
-      <w:proofErr w:type="spellStart"/>
-      <w:r>
-        <w:rPr>
-          <w:rFonts w:ascii="Cambria" w:eastAsia="Cambria" w:hAnsi="Cambria" w:cs="Cambria"/>
-          <w:b w:val="0"/>
-          <w:bCs w:val="0"/>
-          <w:color w:val="auto"/>
-          <w:sz w:val="22"/>
-          <w:szCs w:val="22"/>
-        </w:rPr>
-        <w:t>SQLAlchemy</w:t>
-      </w:r>
-      <w:proofErr w:type="spellEnd"/>
-      <w:r>
-        <w:rPr>
-          <w:rFonts w:ascii="Cambria" w:eastAsia="Cambria" w:hAnsi="Cambria" w:cs="Cambria"/>
-          <w:b w:val="0"/>
-          <w:bCs w:val="0"/>
-          <w:color w:val="auto"/>
-          <w:sz w:val="22"/>
-          <w:szCs w:val="22"/>
-        </w:rPr>
-        <w:t xml:space="preserve">), HTML/CSS/JavaScript web UI, TLS encryption, </w:t>
-      </w:r>
-      <w:proofErr w:type="spellStart"/>
-      <w:r>
-        <w:rPr>
-          <w:rFonts w:ascii="Cambria" w:eastAsia="Cambria" w:hAnsi="Cambria" w:cs="Cambria"/>
-          <w:b w:val="0"/>
-          <w:bCs w:val="0"/>
-          <w:color w:val="auto"/>
-          <w:sz w:val="22"/>
-          <w:szCs w:val="22"/>
-        </w:rPr>
-        <w:t>bcrypt</w:t>
-      </w:r>
-      <w:proofErr w:type="spellEnd"/>
-      <w:r>
-        <w:rPr>
-          <w:rFonts w:ascii="Cambria" w:eastAsia="Cambria" w:hAnsi="Cambria" w:cs="Cambria"/>
-          <w:b w:val="0"/>
-          <w:bCs w:val="0"/>
-          <w:color w:val="auto"/>
-          <w:sz w:val="22"/>
-          <w:szCs w:val="22"/>
-        </w:rPr>
-        <w:t xml:space="preserve"> password hashing, </w:t>
-      </w:r>
-      <w:proofErr w:type="spellStart"/>
-      <w:r>
-        <w:rPr>
-          <w:rFonts w:ascii="Cambria" w:eastAsia="Cambria" w:hAnsi="Cambria" w:cs="Cambria"/>
-          <w:b w:val="0"/>
-          <w:bCs w:val="0"/>
-          <w:color w:val="auto"/>
-          <w:sz w:val="22"/>
-          <w:szCs w:val="22"/>
-        </w:rPr>
-        <w:t>pytest</w:t>
-      </w:r>
-      <w:proofErr w:type="spellEnd"/>
-      <w:r>
-        <w:rPr>
-          <w:rFonts w:ascii="Cambria" w:eastAsia="Cambria" w:hAnsi="Cambria" w:cs="Cambria"/>
-          <w:b w:val="0"/>
-          <w:bCs w:val="0"/>
-          <w:color w:val="auto"/>
-          <w:sz w:val="22"/>
-          <w:szCs w:val="22"/>
-        </w:rPr>
-        <w:t>, GitHub Actions.</w:t>
+        <w:t>Python 3, FastAPI REST APIs, SQLite DB (via SQLAlchemy), HTML/CSS/JavaScript web UI, TLS encryption, bcrypt password hashing, pytest, GitHub Actions.</w:t>
       </w:r>
     </w:p>
     <w:p>
@@ -1217,15 +1090,7 @@
     </w:p>
     <w:p>
       <w:r>
-        <w:t xml:space="preserve">Threat Modeling (STRIDE): Spoofing → login with hashed passwords, lockout after 3 failed attempts and session timeout; Tampering → </w:t>
-      </w:r>
-      <w:proofErr w:type="spellStart"/>
-      <w:r>
-        <w:t>parameterised</w:t>
-      </w:r>
-      <w:proofErr w:type="spellEnd"/>
-      <w:r>
-        <w:t xml:space="preserve"> queries, input validation and all-or-nothing database transactions; Repudiation → append-only audit log of logins, financial and admin actions; Information disclosure → TLS 1.2+, masked account numbers, encrypted ID-proof numbers and no passwords in logs; DoS → rate limiting and health monitoring; Elevation of Privilege → server-side role-based access control (RBAC) on every request.</w:t>
+        <w:t>Threat Modeling (STRIDE): Spoofing → login with hashed passwords, lockout after 3 failed attempts and session timeout; Tampering → parameterised queries, input validation and all-or-nothing database transactions; Repudiation → append-only audit log of logins, financial and admin actions; Information disclosure → TLS 1.2+, masked account numbers, encrypted ID-proof numbers and no passwords in logs; DoS → rate limiting and health monitoring; Elevation of Privilege → server-side role-based access control (RBAC) on every request.</w:t>
       </w:r>
     </w:p>
     <w:p>
@@ -1393,15 +1258,7 @@
     </w:p>
     <w:p>
       <w:r>
-        <w:t xml:space="preserve">A Customer submits a transfer; after </w:t>
-      </w:r>
-      <w:proofErr w:type="spellStart"/>
-      <w:r>
-        <w:t>authorisation</w:t>
-      </w:r>
-      <w:proofErr w:type="spellEnd"/>
-      <w:r>
-        <w:t xml:space="preserve"> checks the Transaction Service debits and credits both accounts inside one database transaction, commits or rolls back together, then logs the event and sends a notification</w:t>
+        <w:t>A Customer submits a transfer; after authorisation checks the Transaction Service debits and credits both accounts inside one database transaction, commits or rolls back together, then logs the event and sends a notification</w:t>
       </w:r>
       <w:r>
         <w:t>.</w:t>
@@ -1465,21 +1322,7 @@
         <w:rPr>
           <w:lang w:val="en-IN"/>
         </w:rPr>
-        <w:t xml:space="preserve">Response: {token, role, </w:t>
-      </w:r>
-      <w:proofErr w:type="spellStart"/>
-      <w:r>
-        <w:rPr>
-          <w:lang w:val="en-IN"/>
-        </w:rPr>
-        <w:t>mustChangePassword</w:t>
-      </w:r>
-      <w:proofErr w:type="spellEnd"/>
-      <w:r>
-        <w:rPr>
-          <w:lang w:val="en-IN"/>
-        </w:rPr>
-        <w:t>}</w:t>
+        <w:t>Response: {token, role, mustChangePassword}</w:t>
       </w:r>
     </w:p>
     <w:p>
@@ -1623,35 +1466,7 @@
         <w:rPr>
           <w:lang w:val="en-IN"/>
         </w:rPr>
-        <w:t>Request: {</w:t>
-      </w:r>
-      <w:proofErr w:type="spellStart"/>
-      <w:r>
-        <w:rPr>
-          <w:lang w:val="en-IN"/>
-        </w:rPr>
-        <w:t>currentPassword</w:t>
-      </w:r>
-      <w:proofErr w:type="spellEnd"/>
-      <w:r>
-        <w:rPr>
-          <w:lang w:val="en-IN"/>
-        </w:rPr>
-        <w:t xml:space="preserve">, </w:t>
-      </w:r>
-      <w:proofErr w:type="spellStart"/>
-      <w:r>
-        <w:rPr>
-          <w:lang w:val="en-IN"/>
-        </w:rPr>
-        <w:t>newPassword</w:t>
-      </w:r>
-      <w:proofErr w:type="spellEnd"/>
-      <w:r>
-        <w:rPr>
-          <w:lang w:val="en-IN"/>
-        </w:rPr>
-        <w:t>}</w:t>
+        <w:t>Request: {currentPassword, newPassword}</w:t>
       </w:r>
     </w:p>
     <w:p>
@@ -1729,62 +1544,20 @@
         <w:rPr>
           <w:lang w:val="en-IN"/>
         </w:rPr>
-        <w:t>Request: {</w:t>
-      </w:r>
-      <w:proofErr w:type="spellStart"/>
-      <w:r>
-        <w:rPr>
-          <w:lang w:val="en-IN"/>
-        </w:rPr>
-        <w:t>accountId</w:t>
-      </w:r>
-      <w:proofErr w:type="spellEnd"/>
-      <w:r>
-        <w:rPr>
-          <w:lang w:val="en-IN"/>
-        </w:rPr>
-        <w:t>, amount}</w:t>
-      </w:r>
-    </w:p>
-    <w:p>
-      <w:pPr>
-        <w:rPr>
-          <w:lang w:val="en-IN"/>
-        </w:rPr>
-      </w:pPr>
-      <w:r>
-        <w:rPr>
-          <w:lang w:val="en-IN"/>
-        </w:rPr>
-        <w:t>Response: {</w:t>
-      </w:r>
-      <w:proofErr w:type="spellStart"/>
-      <w:r>
-        <w:rPr>
-          <w:lang w:val="en-IN"/>
-        </w:rPr>
-        <w:t>transactionId</w:t>
-      </w:r>
-      <w:proofErr w:type="spellEnd"/>
-      <w:r>
-        <w:rPr>
-          <w:lang w:val="en-IN"/>
-        </w:rPr>
-        <w:t xml:space="preserve">, </w:t>
-      </w:r>
-      <w:proofErr w:type="spellStart"/>
-      <w:r>
-        <w:rPr>
-          <w:lang w:val="en-IN"/>
-        </w:rPr>
-        <w:t>receiptNo</w:t>
-      </w:r>
-      <w:proofErr w:type="spellEnd"/>
-      <w:r>
-        <w:rPr>
-          <w:lang w:val="en-IN"/>
-        </w:rPr>
-        <w:t>, balance}</w:t>
+        <w:t>Request: {accountId, amount}</w:t>
+      </w:r>
+    </w:p>
+    <w:p>
+      <w:pPr>
+        <w:rPr>
+          <w:lang w:val="en-IN"/>
+        </w:rPr>
+      </w:pPr>
+      <w:r>
+        <w:rPr>
+          <w:lang w:val="en-IN"/>
+        </w:rPr>
+        <w:t>Response: {transactionId, receiptNo, balance}</w:t>
       </w:r>
     </w:p>
     <w:p>
@@ -1849,48 +1622,20 @@
         <w:rPr>
           <w:lang w:val="en-IN"/>
         </w:rPr>
-        <w:t>Request: {</w:t>
-      </w:r>
-      <w:proofErr w:type="spellStart"/>
-      <w:r>
-        <w:rPr>
-          <w:lang w:val="en-IN"/>
-        </w:rPr>
-        <w:t>accountId</w:t>
-      </w:r>
-      <w:proofErr w:type="spellEnd"/>
-      <w:r>
-        <w:rPr>
-          <w:lang w:val="en-IN"/>
-        </w:rPr>
-        <w:t>, amount}</w:t>
-      </w:r>
-    </w:p>
-    <w:p>
-      <w:pPr>
-        <w:rPr>
-          <w:lang w:val="en-IN"/>
-        </w:rPr>
-      </w:pPr>
-      <w:r>
-        <w:rPr>
-          <w:lang w:val="en-IN"/>
-        </w:rPr>
-        <w:t>Response: {</w:t>
-      </w:r>
-      <w:proofErr w:type="spellStart"/>
-      <w:r>
-        <w:rPr>
-          <w:lang w:val="en-IN"/>
-        </w:rPr>
-        <w:t>transactionId</w:t>
-      </w:r>
-      <w:proofErr w:type="spellEnd"/>
-      <w:r>
-        <w:rPr>
-          <w:lang w:val="en-IN"/>
-        </w:rPr>
-        <w:t>, balance}</w:t>
+        <w:t>Request: {accountId, amount}</w:t>
+      </w:r>
+    </w:p>
+    <w:p>
+      <w:pPr>
+        <w:rPr>
+          <w:lang w:val="en-IN"/>
+        </w:rPr>
+      </w:pPr>
+      <w:r>
+        <w:rPr>
+          <w:lang w:val="en-IN"/>
+        </w:rPr>
+        <w:t>Response: {transactionId, balance}</w:t>
       </w:r>
     </w:p>
     <w:p>
@@ -1955,62 +1700,20 @@
         <w:rPr>
           <w:lang w:val="en-IN"/>
         </w:rPr>
-        <w:t>Request: {</w:t>
-      </w:r>
-      <w:proofErr w:type="spellStart"/>
-      <w:r>
-        <w:rPr>
-          <w:lang w:val="en-IN"/>
-        </w:rPr>
-        <w:t>fromAccount</w:t>
-      </w:r>
-      <w:proofErr w:type="spellEnd"/>
-      <w:r>
-        <w:rPr>
-          <w:lang w:val="en-IN"/>
-        </w:rPr>
-        <w:t xml:space="preserve">, </w:t>
-      </w:r>
-      <w:proofErr w:type="spellStart"/>
-      <w:r>
-        <w:rPr>
-          <w:lang w:val="en-IN"/>
-        </w:rPr>
-        <w:t>toAccount</w:t>
-      </w:r>
-      <w:proofErr w:type="spellEnd"/>
-      <w:r>
-        <w:rPr>
-          <w:lang w:val="en-IN"/>
-        </w:rPr>
-        <w:t>, amount}</w:t>
-      </w:r>
-    </w:p>
-    <w:p>
-      <w:pPr>
-        <w:rPr>
-          <w:lang w:val="en-IN"/>
-        </w:rPr>
-      </w:pPr>
-      <w:r>
-        <w:rPr>
-          <w:lang w:val="en-IN"/>
-        </w:rPr>
-        <w:t xml:space="preserve">Response: {status, </w:t>
-      </w:r>
-      <w:proofErr w:type="spellStart"/>
-      <w:r>
-        <w:rPr>
-          <w:lang w:val="en-IN"/>
-        </w:rPr>
-        <w:t>transactionId</w:t>
-      </w:r>
-      <w:proofErr w:type="spellEnd"/>
-      <w:r>
-        <w:rPr>
-          <w:lang w:val="en-IN"/>
-        </w:rPr>
-        <w:t>, balance}</w:t>
+        <w:t>Request: {fromAccount, toAccount, amount}</w:t>
+      </w:r>
+    </w:p>
+    <w:p>
+      <w:pPr>
+        <w:rPr>
+          <w:lang w:val="en-IN"/>
+        </w:rPr>
+      </w:pPr>
+      <w:r>
+        <w:rPr>
+          <w:lang w:val="en-IN"/>
+        </w:rPr>
+        <w:t>Response: {status, transactionId, balance}</w:t>
       </w:r>
     </w:p>
     <w:p>
@@ -2038,15 +1741,7 @@
     </w:p>
     <w:p>
       <w:r>
-        <w:t xml:space="preserve">Standardized error messages in one JSON format {code, message, timestamp, </w:t>
-      </w:r>
-      <w:proofErr w:type="spellStart"/>
-      <w:r>
-        <w:t>traceId</w:t>
-      </w:r>
-      <w:proofErr w:type="spellEnd"/>
-      <w:r>
-        <w:t>}. No sensitive info in logs (no passwords, account numbers masked). Monitoring includes transaction failure rate, login failure count and system uptime through a /health endpoint.</w:t>
+        <w:t>Standardized error messages in one JSON format {code, message, timestamp, traceId}. No sensitive info in logs (no passwords, account numbers masked). Monitoring includes transaction failure rate, login failure count and system uptime through a /health endpoint.</w:t>
       </w:r>
     </w:p>
     <w:p>
@@ -2059,15 +1754,7 @@
     </w:p>
     <w:p>
       <w:r>
-        <w:t xml:space="preserve">Web UI with accessible font sizes, clear error messages, a responsive layout that works down to 360 </w:t>
-      </w:r>
-      <w:proofErr w:type="spellStart"/>
-      <w:r>
-        <w:t>px</w:t>
-      </w:r>
-      <w:proofErr w:type="spellEnd"/>
-      <w:r>
-        <w:t>, and a confirmation step before money is moved. Separate screens for Customer, Teller and Admin.</w:t>
+        <w:t>Web UI with accessible font sizes, clear error messages, a responsive layout that works down to 360 px, and a confirmation step before money is moved. Separate screens for Customer, Teller and Admin.</w:t>
       </w:r>
     </w:p>
     <w:p>
@@ -2127,21 +1814,7 @@
         <w:rPr>
           <w:lang w:val="en-IN"/>
         </w:rPr>
-        <w:t xml:space="preserve">5.3 Tools: </w:t>
-      </w:r>
-      <w:proofErr w:type="spellStart"/>
-      <w:r>
-        <w:rPr>
-          <w:lang w:val="en-IN"/>
-        </w:rPr>
-        <w:t>PlantUML</w:t>
-      </w:r>
-      <w:proofErr w:type="spellEnd"/>
-      <w:r>
-        <w:rPr>
-          <w:lang w:val="en-IN"/>
-        </w:rPr>
-        <w:t>, draw.io, Postman.</w:t>
+        <w:t>5.3 Tools: PlantUML, draw.io, Postman.</w:t>
       </w:r>
     </w:p>
     <w:p/>

</xml_diff>

<commit_message>
docs(sad): align traceability design IDs with SRS RTM
</commit_message>
<xml_diff>
--- a/docs/sad/SAD_BankManagementSystem_v1.0.docx
+++ b/docs/sad/SAD_BankManagementSystem_v1.0.docx
@@ -79,31 +79,13 @@
     </w:p>
     <w:p>
       <w:r>
-        <w:t>1.0</w:t>
-      </w:r>
-      <w:r>
-        <w:t xml:space="preserve"> | </w:t>
-      </w:r>
-      <w:r>
-        <w:t>12-10-2026</w:t>
-      </w:r>
-      <w:r>
-        <w:t xml:space="preserve"> | </w:t>
+        <w:t xml:space="preserve">1.0 | 12-10-2026 | </w:t>
       </w:r>
       <w:r>
         <w:t>BMS_PES</w:t>
       </w:r>
       <w:r>
-        <w:t xml:space="preserve"> | </w:t>
-      </w:r>
-      <w:r>
-        <w:t>First</w:t>
-      </w:r>
-      <w:r>
-        <w:t xml:space="preserve"> </w:t>
-      </w:r>
-      <w:r>
-        <w:t>draft</w:t>
+        <w:t xml:space="preserve"> | First draft</w:t>
       </w:r>
     </w:p>
     <w:p>
@@ -253,7 +235,31 @@
     </w:p>
     <w:p>
       <w:r>
-        <w:t>Constraints: single-bank scope with no external payment networks; TLS 1.2+ for client–server traffic (BMS-SR-001); fixed stack (Python 3, FastAPI, SQLite via SQLAlchemy, HTML/CSS/JavaScript, pytest, GitHub Actions); delivery in two one-week sprints (19–23 Oct and 26–30 Oct 2026).</w:t>
+        <w:t xml:space="preserve">Constraints: single-bank scope with no external payment networks; TLS 1.2+ for client–server traffic (BMS-SR-001); fixed stack (Python 3, </w:t>
+      </w:r>
+      <w:proofErr w:type="spellStart"/>
+      <w:r>
+        <w:t>FastAPI</w:t>
+      </w:r>
+      <w:proofErr w:type="spellEnd"/>
+      <w:r>
+        <w:t xml:space="preserve">, SQLite via </w:t>
+      </w:r>
+      <w:proofErr w:type="spellStart"/>
+      <w:r>
+        <w:t>SQLAlchemy</w:t>
+      </w:r>
+      <w:proofErr w:type="spellEnd"/>
+      <w:r>
+        <w:t xml:space="preserve">, HTML/CSS/JavaScript, </w:t>
+      </w:r>
+      <w:proofErr w:type="spellStart"/>
+      <w:r>
+        <w:t>pytest</w:t>
+      </w:r>
+      <w:proofErr w:type="spellEnd"/>
+      <w:r>
+        <w:t>, GitHub Actions); delivery in two one-week sprints (19–23 Oct and 26–30 Oct 2026).</w:t>
       </w:r>
     </w:p>
     <w:p>
@@ -300,34 +306,11 @@
       </w:r>
       <w:r>
         <w:br/>
-      </w:r>
-      <w:r>
-        <w:t>Bank/</w:t>
-      </w:r>
-      <w:r>
-        <w:t xml:space="preserve">Regulator: </w:t>
-      </w:r>
-      <w:r>
-        <w:t>Traceability, audit retention, data protection</w:t>
+        <w:t>Bank/Regulator: Traceability, audit retention, data protection</w:t>
       </w:r>
       <w:r>
         <w:br/>
-        <w:t>Developers</w:t>
-      </w:r>
-      <w:r>
-        <w:t xml:space="preserve"> &amp; testers</w:t>
-      </w:r>
-      <w:r>
-        <w:t xml:space="preserve">: </w:t>
-      </w:r>
-      <w:r>
-        <w:t>M</w:t>
-      </w:r>
-      <w:r>
-        <w:t>odularity</w:t>
-      </w:r>
-      <w:r>
-        <w:t>, clear interfaces, testability</w:t>
+        <w:t>Developers &amp; testers: Modularity, clear interfaces, testability</w:t>
       </w:r>
     </w:p>
     <w:p>
@@ -410,7 +393,15 @@
     </w:p>
     <w:p>
       <w:r>
-        <w:t>The system is organised in layers. The Web UI calls REST controllers over HTTPS; controllers pass through the Security Layer and delegate to five services; services use a single Data Access Layer; every service reports security-relevant events to the Audit &amp; Notification Service</w:t>
+        <w:t xml:space="preserve">The system is </w:t>
+      </w:r>
+      <w:proofErr w:type="spellStart"/>
+      <w:r>
+        <w:t>organised</w:t>
+      </w:r>
+      <w:proofErr w:type="spellEnd"/>
+      <w:r>
+        <w:t xml:space="preserve"> in layers. The Web UI calls REST controllers over HTTPS; controllers pass through the Security Layer and delegate to five services; services use a single Data Access Layer; every service reports security-relevant events to the Audit &amp; Notification Service</w:t>
       </w:r>
       <w:r>
         <w:t>.</w:t>
@@ -590,7 +581,103 @@
           <w:sz w:val="22"/>
           <w:szCs w:val="22"/>
         </w:rPr>
-        <w:t>Python 3, FastAPI REST APIs, SQLite DB (via SQLAlchemy), HTML/CSS/JavaScript web UI, TLS encryption, bcrypt password hashing, pytest, GitHub Actions.</w:t>
+        <w:t xml:space="preserve">Python 3, </w:t>
+      </w:r>
+      <w:proofErr w:type="spellStart"/>
+      <w:r>
+        <w:rPr>
+          <w:rFonts w:ascii="Cambria" w:eastAsia="Cambria" w:hAnsi="Cambria" w:cs="Cambria"/>
+          <w:b w:val="0"/>
+          <w:bCs w:val="0"/>
+          <w:color w:val="auto"/>
+          <w:sz w:val="22"/>
+          <w:szCs w:val="22"/>
+        </w:rPr>
+        <w:t>FastAPI</w:t>
+      </w:r>
+      <w:proofErr w:type="spellEnd"/>
+      <w:r>
+        <w:rPr>
+          <w:rFonts w:ascii="Cambria" w:eastAsia="Cambria" w:hAnsi="Cambria" w:cs="Cambria"/>
+          <w:b w:val="0"/>
+          <w:bCs w:val="0"/>
+          <w:color w:val="auto"/>
+          <w:sz w:val="22"/>
+          <w:szCs w:val="22"/>
+        </w:rPr>
+        <w:t xml:space="preserve"> REST APIs, SQLite DB (via </w:t>
+      </w:r>
+      <w:proofErr w:type="spellStart"/>
+      <w:r>
+        <w:rPr>
+          <w:rFonts w:ascii="Cambria" w:eastAsia="Cambria" w:hAnsi="Cambria" w:cs="Cambria"/>
+          <w:b w:val="0"/>
+          <w:bCs w:val="0"/>
+          <w:color w:val="auto"/>
+          <w:sz w:val="22"/>
+          <w:szCs w:val="22"/>
+        </w:rPr>
+        <w:t>SQLAlchemy</w:t>
+      </w:r>
+      <w:proofErr w:type="spellEnd"/>
+      <w:r>
+        <w:rPr>
+          <w:rFonts w:ascii="Cambria" w:eastAsia="Cambria" w:hAnsi="Cambria" w:cs="Cambria"/>
+          <w:b w:val="0"/>
+          <w:bCs w:val="0"/>
+          <w:color w:val="auto"/>
+          <w:sz w:val="22"/>
+          <w:szCs w:val="22"/>
+        </w:rPr>
+        <w:t xml:space="preserve">), HTML/CSS/JavaScript web UI, TLS encryption, </w:t>
+      </w:r>
+      <w:proofErr w:type="spellStart"/>
+      <w:r>
+        <w:rPr>
+          <w:rFonts w:ascii="Cambria" w:eastAsia="Cambria" w:hAnsi="Cambria" w:cs="Cambria"/>
+          <w:b w:val="0"/>
+          <w:bCs w:val="0"/>
+          <w:color w:val="auto"/>
+          <w:sz w:val="22"/>
+          <w:szCs w:val="22"/>
+        </w:rPr>
+        <w:t>bcrypt</w:t>
+      </w:r>
+      <w:proofErr w:type="spellEnd"/>
+      <w:r>
+        <w:rPr>
+          <w:rFonts w:ascii="Cambria" w:eastAsia="Cambria" w:hAnsi="Cambria" w:cs="Cambria"/>
+          <w:b w:val="0"/>
+          <w:bCs w:val="0"/>
+          <w:color w:val="auto"/>
+          <w:sz w:val="22"/>
+          <w:szCs w:val="22"/>
+        </w:rPr>
+        <w:t xml:space="preserve"> password hashing, </w:t>
+      </w:r>
+      <w:proofErr w:type="spellStart"/>
+      <w:r>
+        <w:rPr>
+          <w:rFonts w:ascii="Cambria" w:eastAsia="Cambria" w:hAnsi="Cambria" w:cs="Cambria"/>
+          <w:b w:val="0"/>
+          <w:bCs w:val="0"/>
+          <w:color w:val="auto"/>
+          <w:sz w:val="22"/>
+          <w:szCs w:val="22"/>
+        </w:rPr>
+        <w:t>pytest</w:t>
+      </w:r>
+      <w:proofErr w:type="spellEnd"/>
+      <w:r>
+        <w:rPr>
+          <w:rFonts w:ascii="Cambria" w:eastAsia="Cambria" w:hAnsi="Cambria" w:cs="Cambria"/>
+          <w:b w:val="0"/>
+          <w:bCs w:val="0"/>
+          <w:color w:val="auto"/>
+          <w:sz w:val="22"/>
+          <w:szCs w:val="22"/>
+        </w:rPr>
+        <w:t>, GitHub Actions.</w:t>
       </w:r>
     </w:p>
     <w:p>
@@ -727,69 +814,29 @@
       </w:r>
     </w:p>
     <w:p>
-      <w:pPr>
-        <w:rPr>
-          <w:lang w:val="en-IN"/>
-        </w:rPr>
-      </w:pPr>
-      <w:r>
-        <w:rPr>
-          <w:lang w:val="en-IN"/>
-        </w:rPr>
-        <w:t>BMS-F-010 (Open account) → Account Service, Auth Service (DS-ACC, DS-AUTH)</w:t>
-      </w:r>
-    </w:p>
-    <w:p>
-      <w:pPr>
-        <w:rPr>
-          <w:lang w:val="en-IN"/>
-        </w:rPr>
-      </w:pPr>
-      <w:r>
-        <w:rPr>
-          <w:lang w:val="en-IN"/>
-        </w:rPr>
-        <w:t>BMS-F-011 (Update customer details) → Account Service (DS-ACC)</w:t>
-      </w:r>
-    </w:p>
-    <w:p>
-      <w:pPr>
-        <w:rPr>
-          <w:lang w:val="en-IN"/>
-        </w:rPr>
-      </w:pPr>
-      <w:r>
-        <w:rPr>
-          <w:lang w:val="en-IN"/>
-        </w:rPr>
-        <w:t>BMS-F-012 (Freeze/close account) → Account Service (DS-ACC)</w:t>
-      </w:r>
-    </w:p>
-    <w:p>
-      <w:pPr>
-        <w:rPr>
-          <w:lang w:val="en-IN"/>
-        </w:rPr>
-      </w:pPr>
-      <w:r>
-        <w:rPr>
-          <w:lang w:val="en-IN"/>
-        </w:rPr>
-        <w:t>BMS-F-013 (View balance) → Account Service (DS-ACC)</w:t>
-      </w:r>
-    </w:p>
-    <w:p>
-      <w:pPr>
-        <w:rPr>
-          <w:lang w:val="en-IN"/>
-        </w:rPr>
-      </w:pPr>
-      <w:r>
-        <w:rPr>
-          <w:lang w:val="en-IN"/>
-        </w:rPr>
+      <w:r>
+        <w:t xml:space="preserve">BMS-F-010 (Open account) → Account Service, Auth Service, Transaction Service, Data Access Layer (DS-ACC, DS-AUTH, DS-TXN, DS-DB) </w:t>
+      </w:r>
+    </w:p>
+    <w:p>
+      <w:r>
+        <w:t>BMS-F-011 (Update customer details) → Account Service, Audit Service (DS-ACC, DS-AUD) BMS-F-012 (Freeze/close account) → Account Service, Transaction Service, Audit Service (DS-ACC, DS-TXN, DS-AUD)</w:t>
+      </w:r>
+    </w:p>
+    <w:p>
+      <w:r>
         <w:lastRenderedPageBreak/>
-        <w:t>BMS-F-014 (Search customer) → Account Service (DS-ACC)</w:t>
+        <w:t xml:space="preserve"> BMS-F-013 (View balance) → Account Service, Auth Service, Data Access Layer (DS-ACC, DS-AUTH, DS-DB) </w:t>
+      </w:r>
+    </w:p>
+    <w:p>
+      <w:pPr>
+        <w:rPr>
+          <w:lang w:val="en-IN"/>
+        </w:rPr>
+      </w:pPr>
+      <w:r>
+        <w:t>BMS-F-014 (Search customer) → Account Service, Data Access Layer (DS-ACC, DS-DB)</w:t>
       </w:r>
     </w:p>
     <w:p>
@@ -1078,7 +1125,6 @@
         <w:t>BMS-SR-007 (Masking and encryption of ID proofs) → Security Layer, Data Access Layer (DS-SEC, DS-DB)</w:t>
       </w:r>
     </w:p>
-    <w:p/>
     <w:p>
       <w:pPr>
         <w:pStyle w:val="Heading2"/>
@@ -1090,7 +1136,15 @@
     </w:p>
     <w:p>
       <w:r>
-        <w:t>Threat Modeling (STRIDE): Spoofing → login with hashed passwords, lockout after 3 failed attempts and session timeout; Tampering → parameterised queries, input validation and all-or-nothing database transactions; Repudiation → append-only audit log of logins, financial and admin actions; Information disclosure → TLS 1.2+, masked account numbers, encrypted ID-proof numbers and no passwords in logs; DoS → rate limiting and health monitoring; Elevation of Privilege → server-side role-based access control (RBAC) on every request.</w:t>
+        <w:t xml:space="preserve">Threat Modeling (STRIDE): Spoofing → login with hashed passwords, lockout after 3 failed attempts and session timeout; Tampering → </w:t>
+      </w:r>
+      <w:proofErr w:type="spellStart"/>
+      <w:r>
+        <w:t>parameterised</w:t>
+      </w:r>
+      <w:proofErr w:type="spellEnd"/>
+      <w:r>
+        <w:t xml:space="preserve"> queries, input validation and all-or-nothing database transactions; Repudiation → append-only audit log of logins, financial and admin actions; Information disclosure → TLS 1.2+, masked account numbers, encrypted ID-proof numbers and no passwords in logs; DoS → rate limiting and health monitoring; Elevation of Privilege → server-side role-based access control (RBAC) on every request.</w:t>
       </w:r>
     </w:p>
     <w:p>
@@ -1258,7 +1312,15 @@
     </w:p>
     <w:p>
       <w:r>
-        <w:t>A Customer submits a transfer; after authorisation checks the Transaction Service debits and credits both accounts inside one database transaction, commits or rolls back together, then logs the event and sends a notification</w:t>
+        <w:t xml:space="preserve">A Customer submits a transfer; after </w:t>
+      </w:r>
+      <w:proofErr w:type="spellStart"/>
+      <w:r>
+        <w:t>authorisation</w:t>
+      </w:r>
+      <w:proofErr w:type="spellEnd"/>
+      <w:r>
+        <w:t xml:space="preserve"> checks the Transaction Service debits and credits both accounts inside one database transaction, commits or rolls back together, then logs the event and sends a notification</w:t>
       </w:r>
       <w:r>
         <w:t>.</w:t>
@@ -1322,7 +1384,21 @@
         <w:rPr>
           <w:lang w:val="en-IN"/>
         </w:rPr>
-        <w:t>Response: {token, role, mustChangePassword}</w:t>
+        <w:t xml:space="preserve">Response: {token, role, </w:t>
+      </w:r>
+      <w:proofErr w:type="spellStart"/>
+      <w:r>
+        <w:rPr>
+          <w:lang w:val="en-IN"/>
+        </w:rPr>
+        <w:t>mustChangePassword</w:t>
+      </w:r>
+      <w:proofErr w:type="spellEnd"/>
+      <w:r>
+        <w:rPr>
+          <w:lang w:val="en-IN"/>
+        </w:rPr>
+        <w:t>}</w:t>
       </w:r>
     </w:p>
     <w:p>
@@ -1466,7 +1542,35 @@
         <w:rPr>
           <w:lang w:val="en-IN"/>
         </w:rPr>
-        <w:t>Request: {currentPassword, newPassword}</w:t>
+        <w:t>Request: {</w:t>
+      </w:r>
+      <w:proofErr w:type="spellStart"/>
+      <w:r>
+        <w:rPr>
+          <w:lang w:val="en-IN"/>
+        </w:rPr>
+        <w:t>currentPassword</w:t>
+      </w:r>
+      <w:proofErr w:type="spellEnd"/>
+      <w:r>
+        <w:rPr>
+          <w:lang w:val="en-IN"/>
+        </w:rPr>
+        <w:t xml:space="preserve">, </w:t>
+      </w:r>
+      <w:proofErr w:type="spellStart"/>
+      <w:r>
+        <w:rPr>
+          <w:lang w:val="en-IN"/>
+        </w:rPr>
+        <w:t>newPassword</w:t>
+      </w:r>
+      <w:proofErr w:type="spellEnd"/>
+      <w:r>
+        <w:rPr>
+          <w:lang w:val="en-IN"/>
+        </w:rPr>
+        <w:t>}</w:t>
       </w:r>
     </w:p>
     <w:p>
@@ -1544,20 +1648,62 @@
         <w:rPr>
           <w:lang w:val="en-IN"/>
         </w:rPr>
-        <w:t>Request: {accountId, amount}</w:t>
-      </w:r>
-    </w:p>
-    <w:p>
-      <w:pPr>
-        <w:rPr>
-          <w:lang w:val="en-IN"/>
-        </w:rPr>
-      </w:pPr>
-      <w:r>
-        <w:rPr>
-          <w:lang w:val="en-IN"/>
-        </w:rPr>
-        <w:t>Response: {transactionId, receiptNo, balance}</w:t>
+        <w:t>Request: {</w:t>
+      </w:r>
+      <w:proofErr w:type="spellStart"/>
+      <w:r>
+        <w:rPr>
+          <w:lang w:val="en-IN"/>
+        </w:rPr>
+        <w:t>accountId</w:t>
+      </w:r>
+      <w:proofErr w:type="spellEnd"/>
+      <w:r>
+        <w:rPr>
+          <w:lang w:val="en-IN"/>
+        </w:rPr>
+        <w:t>, amount}</w:t>
+      </w:r>
+    </w:p>
+    <w:p>
+      <w:pPr>
+        <w:rPr>
+          <w:lang w:val="en-IN"/>
+        </w:rPr>
+      </w:pPr>
+      <w:r>
+        <w:rPr>
+          <w:lang w:val="en-IN"/>
+        </w:rPr>
+        <w:t>Response: {</w:t>
+      </w:r>
+      <w:proofErr w:type="spellStart"/>
+      <w:r>
+        <w:rPr>
+          <w:lang w:val="en-IN"/>
+        </w:rPr>
+        <w:t>transactionId</w:t>
+      </w:r>
+      <w:proofErr w:type="spellEnd"/>
+      <w:r>
+        <w:rPr>
+          <w:lang w:val="en-IN"/>
+        </w:rPr>
+        <w:t xml:space="preserve">, </w:t>
+      </w:r>
+      <w:proofErr w:type="spellStart"/>
+      <w:r>
+        <w:rPr>
+          <w:lang w:val="en-IN"/>
+        </w:rPr>
+        <w:t>receiptNo</w:t>
+      </w:r>
+      <w:proofErr w:type="spellEnd"/>
+      <w:r>
+        <w:rPr>
+          <w:lang w:val="en-IN"/>
+        </w:rPr>
+        <w:t>, balance}</w:t>
       </w:r>
     </w:p>
     <w:p>
@@ -1622,20 +1768,48 @@
         <w:rPr>
           <w:lang w:val="en-IN"/>
         </w:rPr>
-        <w:t>Request: {accountId, amount}</w:t>
-      </w:r>
-    </w:p>
-    <w:p>
-      <w:pPr>
-        <w:rPr>
-          <w:lang w:val="en-IN"/>
-        </w:rPr>
-      </w:pPr>
-      <w:r>
-        <w:rPr>
-          <w:lang w:val="en-IN"/>
-        </w:rPr>
-        <w:t>Response: {transactionId, balance}</w:t>
+        <w:t>Request: {</w:t>
+      </w:r>
+      <w:proofErr w:type="spellStart"/>
+      <w:r>
+        <w:rPr>
+          <w:lang w:val="en-IN"/>
+        </w:rPr>
+        <w:t>accountId</w:t>
+      </w:r>
+      <w:proofErr w:type="spellEnd"/>
+      <w:r>
+        <w:rPr>
+          <w:lang w:val="en-IN"/>
+        </w:rPr>
+        <w:t>, amount}</w:t>
+      </w:r>
+    </w:p>
+    <w:p>
+      <w:pPr>
+        <w:rPr>
+          <w:lang w:val="en-IN"/>
+        </w:rPr>
+      </w:pPr>
+      <w:r>
+        <w:rPr>
+          <w:lang w:val="en-IN"/>
+        </w:rPr>
+        <w:t>Response: {</w:t>
+      </w:r>
+      <w:proofErr w:type="spellStart"/>
+      <w:r>
+        <w:rPr>
+          <w:lang w:val="en-IN"/>
+        </w:rPr>
+        <w:t>transactionId</w:t>
+      </w:r>
+      <w:proofErr w:type="spellEnd"/>
+      <w:r>
+        <w:rPr>
+          <w:lang w:val="en-IN"/>
+        </w:rPr>
+        <w:t>, balance}</w:t>
       </w:r>
     </w:p>
     <w:p>
@@ -1700,20 +1874,62 @@
         <w:rPr>
           <w:lang w:val="en-IN"/>
         </w:rPr>
-        <w:t>Request: {fromAccount, toAccount, amount}</w:t>
-      </w:r>
-    </w:p>
-    <w:p>
-      <w:pPr>
-        <w:rPr>
-          <w:lang w:val="en-IN"/>
-        </w:rPr>
-      </w:pPr>
-      <w:r>
-        <w:rPr>
-          <w:lang w:val="en-IN"/>
-        </w:rPr>
-        <w:t>Response: {status, transactionId, balance}</w:t>
+        <w:t>Request: {</w:t>
+      </w:r>
+      <w:proofErr w:type="spellStart"/>
+      <w:r>
+        <w:rPr>
+          <w:lang w:val="en-IN"/>
+        </w:rPr>
+        <w:t>fromAccount</w:t>
+      </w:r>
+      <w:proofErr w:type="spellEnd"/>
+      <w:r>
+        <w:rPr>
+          <w:lang w:val="en-IN"/>
+        </w:rPr>
+        <w:t xml:space="preserve">, </w:t>
+      </w:r>
+      <w:proofErr w:type="spellStart"/>
+      <w:r>
+        <w:rPr>
+          <w:lang w:val="en-IN"/>
+        </w:rPr>
+        <w:t>toAccount</w:t>
+      </w:r>
+      <w:proofErr w:type="spellEnd"/>
+      <w:r>
+        <w:rPr>
+          <w:lang w:val="en-IN"/>
+        </w:rPr>
+        <w:t>, amount}</w:t>
+      </w:r>
+    </w:p>
+    <w:p>
+      <w:pPr>
+        <w:rPr>
+          <w:lang w:val="en-IN"/>
+        </w:rPr>
+      </w:pPr>
+      <w:r>
+        <w:rPr>
+          <w:lang w:val="en-IN"/>
+        </w:rPr>
+        <w:t xml:space="preserve">Response: {status, </w:t>
+      </w:r>
+      <w:proofErr w:type="spellStart"/>
+      <w:r>
+        <w:rPr>
+          <w:lang w:val="en-IN"/>
+        </w:rPr>
+        <w:t>transactionId</w:t>
+      </w:r>
+      <w:proofErr w:type="spellEnd"/>
+      <w:r>
+        <w:rPr>
+          <w:lang w:val="en-IN"/>
+        </w:rPr>
+        <w:t>, balance}</w:t>
       </w:r>
     </w:p>
     <w:p>
@@ -1741,7 +1957,15 @@
     </w:p>
     <w:p>
       <w:r>
-        <w:t>Standardized error messages in one JSON format {code, message, timestamp, traceId}. No sensitive info in logs (no passwords, account numbers masked). Monitoring includes transaction failure rate, login failure count and system uptime through a /health endpoint.</w:t>
+        <w:t xml:space="preserve">Standardized error messages in one JSON format {code, message, timestamp, </w:t>
+      </w:r>
+      <w:proofErr w:type="spellStart"/>
+      <w:r>
+        <w:t>traceId</w:t>
+      </w:r>
+      <w:proofErr w:type="spellEnd"/>
+      <w:r>
+        <w:t>}. No sensitive info in logs (no passwords, account numbers masked). Monitoring includes transaction failure rate, login failure count and system uptime through a /health endpoint.</w:t>
       </w:r>
     </w:p>
     <w:p>
@@ -1754,7 +1978,15 @@
     </w:p>
     <w:p>
       <w:r>
-        <w:t>Web UI with accessible font sizes, clear error messages, a responsive layout that works down to 360 px, and a confirmation step before money is moved. Separate screens for Customer, Teller and Admin.</w:t>
+        <w:t xml:space="preserve">Web UI with accessible font sizes, clear error messages, a responsive layout that works down to 360 </w:t>
+      </w:r>
+      <w:proofErr w:type="spellStart"/>
+      <w:r>
+        <w:t>px</w:t>
+      </w:r>
+      <w:proofErr w:type="spellEnd"/>
+      <w:r>
+        <w:t>, and a confirmation step before money is moved. Separate screens for Customer, Teller and Admin.</w:t>
       </w:r>
     </w:p>
     <w:p>
@@ -1814,7 +2046,21 @@
         <w:rPr>
           <w:lang w:val="en-IN"/>
         </w:rPr>
-        <w:t>5.3 Tools: PlantUML, draw.io, Postman.</w:t>
+        <w:t xml:space="preserve">5.3 Tools: </w:t>
+      </w:r>
+      <w:proofErr w:type="spellStart"/>
+      <w:r>
+        <w:rPr>
+          <w:lang w:val="en-IN"/>
+        </w:rPr>
+        <w:t>PlantUML</w:t>
+      </w:r>
+      <w:proofErr w:type="spellEnd"/>
+      <w:r>
+        <w:rPr>
+          <w:lang w:val="en-IN"/>
+        </w:rPr>
+        <w:t>, draw.io, Postman.</w:t>
       </w:r>
     </w:p>
     <w:p/>

</xml_diff>